<commit_message>
Complete everthing for week2
</commit_message>
<xml_diff>
--- a/SengMengseang_S2 - PRACTICE -  Native HTTP.docx
+++ b/SengMengseang_S2 - PRACTICE -  Native HTTP.docx
@@ -14,6 +14,7 @@
         <w:rPr>
           <w:rFonts w:asciiTheme="majorHAnsi" w:hAnsiTheme="majorHAnsi" w:cstheme="majorHAnsi"/>
           <w:b/>
+          <w:u w:val="single"/>
         </w:rPr>
         <w:t>W</w:t>
       </w:r>
@@ -21,6 +22,7 @@
         <w:rPr>
           <w:rFonts w:asciiTheme="majorHAnsi" w:hAnsiTheme="majorHAnsi" w:cstheme="majorHAnsi"/>
           <w:b/>
+          <w:u w:val="single"/>
         </w:rPr>
         <w:t>2</w:t>
       </w:r>
@@ -34,13 +36,6 @@
     <w:p>
       <w:pPr>
         <w:jc w:val="center"/>
-        <w:rPr>
-          <w:rFonts w:asciiTheme="majorHAnsi" w:hAnsiTheme="majorHAnsi" w:cstheme="majorHAnsi"/>
-        </w:rPr>
-      </w:pPr>
-      <w:bookmarkStart w:id="0" w:name="_heading=h.30j0zll" w:colFirst="0" w:colLast="0"/>
-      <w:bookmarkEnd w:id="0"/>
-      <w:r>
         <w:rPr>
           <w:rFonts w:asciiTheme="majorHAnsi" w:hAnsiTheme="majorHAnsi" w:cstheme="majorHAnsi"/>
           <w:i/>
@@ -49,7 +44,59 @@
           <w:szCs w:val="56"/>
           <w:lang w:val="pt-BR"/>
         </w:rPr>
+      </w:pPr>
+      <w:bookmarkStart w:id="0" w:name="_heading=h.30j0zll" w:colFirst="0" w:colLast="0"/>
+      <w:bookmarkEnd w:id="0"/>
+      <w:r>
+        <w:rPr>
+          <w:rFonts w:asciiTheme="majorHAnsi" w:hAnsiTheme="majorHAnsi" w:cstheme="majorHAnsi"/>
+          <w:i/>
+          <w:iCs/>
+          <w:sz w:val="56"/>
+          <w:szCs w:val="56"/>
+          <w:lang w:val="pt-BR"/>
+        </w:rPr>
         <w:t>Native HTTP and Manual Routing</w:t>
+      </w:r>
+    </w:p>
+    <w:p>
+      <w:pPr>
+        <w:rPr>
+          <w:rFonts w:asciiTheme="majorHAnsi" w:hAnsiTheme="majorHAnsi" w:cstheme="majorHAnsi"/>
+          <w:b/>
+          <w:bCs/>
+          <w:color w:val="EE0000"/>
+          <w:u w:val="single"/>
+        </w:rPr>
+      </w:pPr>
+      <w:r>
+        <w:rPr>
+          <w:rFonts w:asciiTheme="majorHAnsi" w:hAnsiTheme="majorHAnsi" w:cstheme="majorHAnsi"/>
+          <w:b/>
+          <w:bCs/>
+          <w:i/>
+          <w:iCs/>
+          <w:color w:val="EE0000"/>
+          <w:u w:val="single"/>
+          <w:lang w:val="pt-BR"/>
+        </w:rPr>
+        <w:t>Github link:</w:t>
+      </w:r>
+      <w:r>
+        <w:t xml:space="preserve"> </w:t>
+      </w:r>
+      <w:r>
+        <w:rPr>
+          <w:rFonts w:asciiTheme="majorHAnsi" w:hAnsiTheme="majorHAnsi" w:cstheme="majorHAnsi"/>
+          <w:b/>
+          <w:bCs/>
+          <w:i/>
+          <w:iCs/>
+          <w:color w:val="EE0000"/>
+          <w:u w:val="single"/>
+          <w:lang w:val="pt-BR"/>
+        </w:rPr>
+        <w:t>https://github.com/mengmeng-sys/Term3_W2_BackendDevelopment.git</w:t>
       </w:r>
     </w:p>
     <w:p>
@@ -124,7 +171,33 @@
         <w:rPr>
           <w:rFonts w:asciiTheme="majorHAnsi" w:hAnsiTheme="majorHAnsi" w:cstheme="majorHAnsi"/>
         </w:rPr>
-        <w:t xml:space="preserve">  At the end of this practice, you can</w:t>
+        <w:t xml:space="preserve">  At the end of this practice, </w:t>
+      </w:r>
+      <w:proofErr w:type="spellStart"/>
+      <w:r>
+        <w:rPr>
+          <w:rFonts w:asciiTheme="majorHAnsi" w:hAnsiTheme="majorHAnsi" w:cstheme="majorHAnsi"/>
+        </w:rPr>
+        <w:t>y</w:t>
+      </w:r>
+      <w:r>
+        <w:rPr>
+          <w:rFonts w:asciiTheme="majorHAnsi" w:hAnsiTheme="majorHAnsi" w:cstheme="majorHAnsi"/>
+        </w:rPr>
+        <w:t>f</w:t>
+      </w:r>
+      <w:r>
+        <w:rPr>
+          <w:rFonts w:asciiTheme="majorHAnsi" w:hAnsiTheme="majorHAnsi" w:cstheme="majorHAnsi"/>
+        </w:rPr>
+        <w:t>ou</w:t>
+      </w:r>
+      <w:proofErr w:type="spellEnd"/>
+      <w:r>
+        <w:rPr>
+          <w:rFonts w:asciiTheme="majorHAnsi" w:hAnsiTheme="majorHAnsi" w:cstheme="majorHAnsi"/>
+        </w:rPr>
+        <w:t xml:space="preserve"> can</w:t>
       </w:r>
     </w:p>
     <w:p>
@@ -1037,8 +1110,20 @@
           <w:szCs w:val="21"/>
           <w:lang w:val="en-US"/>
         </w:rPr>
-        <w:t>('http');</w:t>
-      </w:r>
+        <w:t>('http'</w:t>
+      </w:r>
+      <w:proofErr w:type="gramStart"/>
+      <w:r>
+        <w:rPr>
+          <w:rFonts w:ascii="Consolas" w:hAnsi="Consolas"/>
+          <w:color w:val="000000"/>
+          <w:sz w:val="21"/>
+          <w:szCs w:val="21"/>
+          <w:lang w:val="en-US"/>
+        </w:rPr>
+        <w:t>);</w:t>
+      </w:r>
+      <w:proofErr w:type="gramEnd"/>
     </w:p>
     <w:p>
       <w:pPr>
@@ -1095,7 +1180,19 @@
           <w:szCs w:val="21"/>
           <w:lang w:val="en-US"/>
         </w:rPr>
-        <w:t>server = http.</w:t>
+        <w:t xml:space="preserve">server = </w:t>
+      </w:r>
+      <w:proofErr w:type="spellStart"/>
+      <w:proofErr w:type="gramStart"/>
+      <w:r>
+        <w:rPr>
+          <w:rFonts w:ascii="Consolas" w:hAnsi="Consolas"/>
+          <w:color w:val="000000"/>
+          <w:sz w:val="21"/>
+          <w:szCs w:val="21"/>
+          <w:lang w:val="en-US"/>
+        </w:rPr>
+        <w:t>http.</w:t>
       </w:r>
       <w:r>
         <w:rPr>
@@ -1107,6 +1204,8 @@
         </w:rPr>
         <w:t>createServer</w:t>
       </w:r>
+      <w:proofErr w:type="spellEnd"/>
+      <w:proofErr w:type="gramEnd"/>
       <w:r>
         <w:rPr>
           <w:rFonts w:ascii="Consolas" w:hAnsi="Consolas"/>
@@ -1144,7 +1243,31 @@
           <w:szCs w:val="21"/>
           <w:lang w:val="en-US"/>
         </w:rPr>
-        <w:t xml:space="preserve">  res.write('Hello, World!');</w:t>
+        <w:t xml:space="preserve">  </w:t>
+      </w:r>
+      <w:proofErr w:type="spellStart"/>
+      <w:proofErr w:type="gramStart"/>
+      <w:r>
+        <w:rPr>
+          <w:rFonts w:ascii="Consolas" w:hAnsi="Consolas"/>
+          <w:color w:val="000000"/>
+          <w:sz w:val="21"/>
+          <w:szCs w:val="21"/>
+          <w:lang w:val="en-US"/>
+        </w:rPr>
+        <w:t>res.write</w:t>
+      </w:r>
+      <w:proofErr w:type="spellEnd"/>
+      <w:proofErr w:type="gramEnd"/>
+      <w:r>
+        <w:rPr>
+          <w:rFonts w:ascii="Consolas" w:hAnsi="Consolas"/>
+          <w:color w:val="000000"/>
+          <w:sz w:val="21"/>
+          <w:szCs w:val="21"/>
+          <w:lang w:val="en-US"/>
+        </w:rPr>
+        <w:t>('Hello, World!');</w:t>
       </w:r>
     </w:p>
     <w:p>
@@ -1185,6 +1308,8 @@
         </w:rPr>
         <w:t xml:space="preserve">return </w:t>
       </w:r>
+      <w:proofErr w:type="spellStart"/>
+      <w:proofErr w:type="gramStart"/>
       <w:r>
         <w:rPr>
           <w:rFonts w:ascii="Consolas" w:hAnsi="Consolas"/>
@@ -1193,7 +1318,19 @@
           <w:szCs w:val="21"/>
           <w:lang w:val="en-US"/>
         </w:rPr>
-        <w:t>res.endd();</w:t>
+        <w:t>res.endd</w:t>
+      </w:r>
+      <w:proofErr w:type="spellEnd"/>
+      <w:proofErr w:type="gramEnd"/>
+      <w:r>
+        <w:rPr>
+          <w:rFonts w:ascii="Consolas" w:hAnsi="Consolas"/>
+          <w:color w:val="000000"/>
+          <w:sz w:val="21"/>
+          <w:szCs w:val="21"/>
+          <w:lang w:val="en-US"/>
+        </w:rPr>
+        <w:t>();</w:t>
       </w:r>
     </w:p>
     <w:p>
@@ -1262,6 +1399,7 @@
           <w:lang w:val="en-US"/>
         </w:rPr>
       </w:pPr>
+      <w:proofErr w:type="spellStart"/>
       <w:r>
         <w:rPr>
           <w:rFonts w:ascii="Consolas" w:hAnsi="Consolas"/>
@@ -1282,6 +1420,7 @@
         </w:rPr>
         <w:t>listen</w:t>
       </w:r>
+      <w:proofErr w:type="spellEnd"/>
       <w:r>
         <w:rPr>
           <w:rFonts w:ascii="Consolas" w:hAnsi="Consolas"/>
@@ -1321,6 +1460,7 @@
         </w:rPr>
         <w:t xml:space="preserve">  </w:t>
       </w:r>
+      <w:proofErr w:type="gramStart"/>
       <w:r>
         <w:rPr>
           <w:rFonts w:ascii="Consolas" w:hAnsi="Consolas"/>
@@ -1339,7 +1479,18 @@
           <w:szCs w:val="21"/>
           <w:lang w:val="en-US"/>
         </w:rPr>
-        <w:t>.log('Server running on http://localhost:3000');</w:t>
+        <w:t>.log(</w:t>
+      </w:r>
+      <w:proofErr w:type="gramEnd"/>
+      <w:r>
+        <w:rPr>
+          <w:rFonts w:ascii="Consolas" w:hAnsi="Consolas"/>
+          <w:color w:val="000000"/>
+          <w:sz w:val="21"/>
+          <w:szCs w:val="21"/>
+          <w:lang w:val="en-US"/>
+        </w:rPr>
+        <w:t>'Server running on http://localhost:3000');</w:t>
       </w:r>
     </w:p>
     <w:p>
@@ -1397,8 +1548,52 @@
         <w:t>? What line of code causes it?</w:t>
       </w:r>
     </w:p>
+    <w:p>
+      <w:pPr>
+        <w:rPr>
+          <w:lang w:val="en-US"/>
+        </w:rPr>
+      </w:pPr>
+      <w:r>
+        <w:rPr>
+          <w:i/>
+          <w:iCs/>
+          <w:lang w:val="en-US"/>
+        </w:rPr>
+        <w:t xml:space="preserve">Answer: </w:t>
+      </w:r>
+      <w:proofErr w:type="spellStart"/>
+      <w:proofErr w:type="gramStart"/>
+      <w:r>
+        <w:rPr>
+          <w:i/>
+          <w:iCs/>
+          <w:lang w:val="en-US"/>
+        </w:rPr>
+        <w:t>res.endd</w:t>
+      </w:r>
+      <w:proofErr w:type="spellEnd"/>
+      <w:proofErr w:type="gramEnd"/>
+      <w:r>
+        <w:rPr>
+          <w:i/>
+          <w:iCs/>
+          <w:lang w:val="en-US"/>
+        </w:rPr>
+        <w:t xml:space="preserve">(); </w:t>
+      </w:r>
+      <w:r>
+        <w:rPr>
+          <w:i/>
+          <w:iCs/>
+          <w:lang w:val="en-US"/>
+        </w:rPr>
+        <w:t xml:space="preserve">is not the function </w:t>
+      </w:r>
+    </w:p>
     <w:p/>
     <w:p/>
+    <w:p/>
     <w:p>
       <w:r>
         <w:rPr>
@@ -1427,118 +1622,769 @@
       <w:r>
         <w:t xml:space="preserve">What is the purpose of </w:t>
       </w:r>
+      <w:proofErr w:type="gramStart"/>
       <w:r>
         <w:rPr>
           <w:rStyle w:val="HTMLCode"/>
         </w:rPr>
-        <w:t>res.write()</w:t>
+        <w:t>res.write</w:t>
+      </w:r>
+      <w:proofErr w:type="gramEnd"/>
+      <w:r>
+        <w:rPr>
+          <w:rStyle w:val="HTMLCode"/>
+        </w:rPr>
+        <w:t>()</w:t>
       </w:r>
       <w:r>
         <w:t xml:space="preserve"> and how is it different from </w:t>
       </w:r>
+      <w:proofErr w:type="spellStart"/>
       <w:r>
         <w:rPr>
           <w:rStyle w:val="HTMLCode"/>
         </w:rPr>
-        <w:t>res.end()</w:t>
+        <w:t>res.end</w:t>
+      </w:r>
+      <w:proofErr w:type="spellEnd"/>
+      <w:r>
+        <w:rPr>
+          <w:rStyle w:val="HTMLCode"/>
+        </w:rPr>
+        <w:t>()</w:t>
       </w:r>
       <w:r>
         <w:t>?</w:t>
       </w:r>
     </w:p>
-    <w:p/>
-    <w:p/>
-    <w:p>
-      <w:r>
-        <w:rPr>
-          <w:b/>
-          <w:bCs/>
-        </w:rPr>
-        <w:t>Q</w:t>
-      </w:r>
-      <w:r>
-        <w:rPr>
-          <w:b/>
-          <w:bCs/>
-        </w:rPr>
-        <w:t>3</w:t>
-      </w:r>
-      <w:r>
-        <w:rPr>
-          <w:b/>
-          <w:bCs/>
-        </w:rPr>
-        <w:t xml:space="preserve"> –</w:t>
-      </w:r>
-      <w:r>
-        <w:t xml:space="preserve"> </w:t>
-      </w:r>
-      <w:r>
-        <w:t xml:space="preserve">What do you think will happen if </w:t>
-      </w:r>
-      <w:r>
-        <w:rPr>
-          <w:rStyle w:val="HTMLCode"/>
-        </w:rPr>
-        <w:t>res.end()</w:t>
-      </w:r>
-      <w:r>
-        <w:t xml:space="preserve"> is not called at all?</w:t>
-      </w:r>
-    </w:p>
-    <w:p/>
-    <w:p/>
-    <w:p>
-      <w:r>
-        <w:rPr>
-          <w:b/>
-          <w:bCs/>
-        </w:rPr>
-        <w:t>Q</w:t>
-      </w:r>
-      <w:r>
-        <w:rPr>
-          <w:b/>
-          <w:bCs/>
-        </w:rPr>
-        <w:t>4</w:t>
-      </w:r>
-      <w:r>
-        <w:rPr>
-          <w:b/>
-          <w:bCs/>
-        </w:rPr>
-        <w:t xml:space="preserve"> –</w:t>
-      </w:r>
-      <w:r>
-        <w:t xml:space="preserve"> </w:t>
-      </w:r>
-      <w:r>
-        <w:t xml:space="preserve">Why do we use </w:t>
-      </w:r>
-      <w:r>
-        <w:rPr>
-          <w:rStyle w:val="HTMLCode"/>
-        </w:rPr>
-        <w:t>http.createServer()</w:t>
-      </w:r>
-      <w:r>
-        <w:t xml:space="preserve"> instead of just calling a function directly?</w:t>
-      </w:r>
-    </w:p>
-    <w:p>
-      <w:r>
-        <w:t xml:space="preserve"> </w:t>
-      </w:r>
-    </w:p>
-    <w:p/>
-    <w:p>
-      <w:r>
+    <w:p>
+      <w:pPr>
         <w:rPr>
           <w:b/>
           <w:bCs/>
           <w:lang w:val="en-US"/>
         </w:rPr>
+      </w:pPr>
+      <w:r>
+        <w:t xml:space="preserve">Answer: </w:t>
+      </w:r>
+      <w:r>
+        <w:rPr>
+          <w:b/>
+          <w:bCs/>
+          <w:lang w:val="en-US"/>
+        </w:rPr>
+        <w:t xml:space="preserve">Q2 – </w:t>
+      </w:r>
+      <w:proofErr w:type="spellStart"/>
+      <w:proofErr w:type="gramStart"/>
+      <w:r>
+        <w:rPr>
+          <w:b/>
+          <w:bCs/>
+          <w:lang w:val="en-US"/>
+        </w:rPr>
+        <w:t>res.write</w:t>
+      </w:r>
+      <w:proofErr w:type="spellEnd"/>
+      <w:proofErr w:type="gramEnd"/>
+      <w:r>
+        <w:rPr>
+          <w:b/>
+          <w:bCs/>
+          <w:lang w:val="en-US"/>
+        </w:rPr>
+        <w:t xml:space="preserve">() vs </w:t>
+      </w:r>
+      <w:proofErr w:type="spellStart"/>
+      <w:r>
+        <w:rPr>
+          <w:b/>
+          <w:bCs/>
+          <w:lang w:val="en-US"/>
+        </w:rPr>
+        <w:t>res.end</w:t>
+      </w:r>
+      <w:proofErr w:type="spellEnd"/>
+      <w:r>
+        <w:rPr>
+          <w:b/>
+          <w:bCs/>
+          <w:lang w:val="en-US"/>
+        </w:rPr>
+        <w:t>()</w:t>
+      </w:r>
+    </w:p>
+    <w:p>
+      <w:pPr>
+        <w:rPr>
+          <w:b/>
+          <w:bCs/>
+          <w:lang w:val="en-US"/>
+        </w:rPr>
+      </w:pPr>
+    </w:p>
+    <w:tbl>
+      <w:tblPr>
+        <w:tblW w:w="0" w:type="auto"/>
+        <w:tblCellSpacing w:w="15" w:type="dxa"/>
+        <w:tblCellMar>
+          <w:top w:w="15" w:type="dxa"/>
+          <w:left w:w="15" w:type="dxa"/>
+          <w:bottom w:w="15" w:type="dxa"/>
+          <w:right w:w="15" w:type="dxa"/>
+        </w:tblCellMar>
+        <w:tblLook w:val="04A0" w:firstRow="1" w:lastRow="0" w:firstColumn="1" w:lastColumn="0" w:noHBand="0" w:noVBand="1"/>
+      </w:tblPr>
+      <w:tblGrid>
+        <w:gridCol w:w="2448"/>
+        <w:gridCol w:w="3581"/>
+        <w:gridCol w:w="3311"/>
+      </w:tblGrid>
+      <w:tr>
+        <w:trPr>
+          <w:tblHeader/>
+          <w:tblCellSpacing w:w="15" w:type="dxa"/>
+        </w:trPr>
+        <w:tc>
+          <w:tcPr>
+            <w:tcW w:w="0" w:type="auto"/>
+            <w:vAlign w:val="center"/>
+            <w:hideMark/>
+          </w:tcPr>
+          <w:p>
+            <w:pPr>
+              <w:rPr>
+                <w:lang w:val="en-US"/>
+              </w:rPr>
+            </w:pPr>
+          </w:p>
+        </w:tc>
+        <w:tc>
+          <w:tcPr>
+            <w:tcW w:w="0" w:type="auto"/>
+            <w:vAlign w:val="center"/>
+            <w:hideMark/>
+          </w:tcPr>
+          <w:p>
+            <w:pPr>
+              <w:rPr>
+                <w:b/>
+                <w:bCs/>
+                <w:lang w:val="en-US"/>
+              </w:rPr>
+            </w:pPr>
+            <w:proofErr w:type="spellStart"/>
+            <w:proofErr w:type="gramStart"/>
+            <w:r>
+              <w:rPr>
+                <w:b/>
+                <w:bCs/>
+                <w:lang w:val="en-US"/>
+              </w:rPr>
+              <w:t>res.write</w:t>
+            </w:r>
+            <w:proofErr w:type="spellEnd"/>
+            <w:proofErr w:type="gramEnd"/>
+            <w:r>
+              <w:rPr>
+                <w:b/>
+                <w:bCs/>
+                <w:lang w:val="en-US"/>
+              </w:rPr>
+              <w:t>()</w:t>
+            </w:r>
+          </w:p>
+        </w:tc>
+        <w:tc>
+          <w:tcPr>
+            <w:tcW w:w="0" w:type="auto"/>
+            <w:vAlign w:val="center"/>
+            <w:hideMark/>
+          </w:tcPr>
+          <w:p>
+            <w:pPr>
+              <w:rPr>
+                <w:b/>
+                <w:bCs/>
+                <w:lang w:val="en-US"/>
+              </w:rPr>
+            </w:pPr>
+            <w:proofErr w:type="spellStart"/>
+            <w:proofErr w:type="gramStart"/>
+            <w:r>
+              <w:rPr>
+                <w:b/>
+                <w:bCs/>
+                <w:lang w:val="en-US"/>
+              </w:rPr>
+              <w:t>res.end</w:t>
+            </w:r>
+            <w:proofErr w:type="spellEnd"/>
+            <w:r>
+              <w:rPr>
+                <w:b/>
+                <w:bCs/>
+                <w:lang w:val="en-US"/>
+              </w:rPr>
+              <w:t>(</w:t>
+            </w:r>
+            <w:proofErr w:type="gramEnd"/>
+            <w:r>
+              <w:rPr>
+                <w:b/>
+                <w:bCs/>
+                <w:lang w:val="en-US"/>
+              </w:rPr>
+              <w:t>)</w:t>
+            </w:r>
+          </w:p>
+        </w:tc>
+      </w:tr>
+      <w:tr>
+        <w:trPr>
+          <w:tblCellSpacing w:w="15" w:type="dxa"/>
+        </w:trPr>
+        <w:tc>
+          <w:tcPr>
+            <w:tcW w:w="0" w:type="auto"/>
+            <w:vAlign w:val="center"/>
+            <w:hideMark/>
+          </w:tcPr>
+          <w:p>
+            <w:pPr>
+              <w:rPr>
+                <w:lang w:val="en-US"/>
+              </w:rPr>
+            </w:pPr>
+            <w:r>
+              <w:rPr>
+                <w:b/>
+                <w:bCs/>
+                <w:lang w:val="en-US"/>
+              </w:rPr>
+              <w:t>Purpose</w:t>
+            </w:r>
+          </w:p>
+        </w:tc>
+        <w:tc>
+          <w:tcPr>
+            <w:tcW w:w="0" w:type="auto"/>
+            <w:vAlign w:val="center"/>
+            <w:hideMark/>
+          </w:tcPr>
+          <w:p>
+            <w:pPr>
+              <w:rPr>
+                <w:lang w:val="en-US"/>
+              </w:rPr>
+            </w:pPr>
+            <w:r>
+              <w:rPr>
+                <w:lang w:val="en-US"/>
+              </w:rPr>
+              <w:t xml:space="preserve">Sends a </w:t>
+            </w:r>
+            <w:r>
+              <w:rPr>
+                <w:b/>
+                <w:bCs/>
+                <w:lang w:val="en-US"/>
+              </w:rPr>
+              <w:t>chunk</w:t>
+            </w:r>
+            <w:r>
+              <w:rPr>
+                <w:lang w:val="en-US"/>
+              </w:rPr>
+              <w:t xml:space="preserve"> of the response body</w:t>
+            </w:r>
+          </w:p>
+        </w:tc>
+        <w:tc>
+          <w:tcPr>
+            <w:tcW w:w="0" w:type="auto"/>
+            <w:vAlign w:val="center"/>
+            <w:hideMark/>
+          </w:tcPr>
+          <w:p>
+            <w:pPr>
+              <w:rPr>
+                <w:lang w:val="en-US"/>
+              </w:rPr>
+            </w:pPr>
+            <w:r>
+              <w:rPr>
+                <w:b/>
+                <w:bCs/>
+                <w:lang w:val="en-US"/>
+              </w:rPr>
+              <w:t>Finalizes</w:t>
+            </w:r>
+            <w:r>
+              <w:rPr>
+                <w:lang w:val="en-US"/>
+              </w:rPr>
+              <w:t xml:space="preserve"> and closes the response</w:t>
+            </w:r>
+          </w:p>
+        </w:tc>
+      </w:tr>
+      <w:tr>
+        <w:trPr>
+          <w:tblCellSpacing w:w="15" w:type="dxa"/>
+        </w:trPr>
+        <w:tc>
+          <w:tcPr>
+            <w:tcW w:w="0" w:type="auto"/>
+            <w:vAlign w:val="center"/>
+            <w:hideMark/>
+          </w:tcPr>
+          <w:p>
+            <w:pPr>
+              <w:rPr>
+                <w:lang w:val="en-US"/>
+              </w:rPr>
+            </w:pPr>
+            <w:r>
+              <w:rPr>
+                <w:b/>
+                <w:bCs/>
+                <w:lang w:val="en-US"/>
+              </w:rPr>
+              <w:t>Can call multiple times?</w:t>
+            </w:r>
+          </w:p>
+        </w:tc>
+        <w:tc>
+          <w:tcPr>
+            <w:tcW w:w="0" w:type="auto"/>
+            <w:vAlign w:val="center"/>
+            <w:hideMark/>
+          </w:tcPr>
+          <w:p>
+            <w:pPr>
+              <w:rPr>
+                <w:lang w:val="en-US"/>
+              </w:rPr>
+            </w:pPr>
+            <w:r>
+              <w:rPr>
+                <w:lang w:val="en-US"/>
+              </w:rPr>
+              <w:t xml:space="preserve"> Yes</w:t>
+            </w:r>
+          </w:p>
+        </w:tc>
+        <w:tc>
+          <w:tcPr>
+            <w:tcW w:w="0" w:type="auto"/>
+            <w:vAlign w:val="center"/>
+            <w:hideMark/>
+          </w:tcPr>
+          <w:p>
+            <w:pPr>
+              <w:rPr>
+                <w:lang w:val="en-US"/>
+              </w:rPr>
+            </w:pPr>
+            <w:r>
+              <w:rPr>
+                <w:lang w:val="en-US"/>
+              </w:rPr>
+              <w:t xml:space="preserve"> No </w:t>
+            </w:r>
+            <w:r>
+              <w:rPr>
+                <w:lang w:val="en-US"/>
+              </w:rPr>
+              <w:t>(</w:t>
+            </w:r>
+            <w:r>
+              <w:rPr>
+                <w:lang w:val="en-US"/>
+              </w:rPr>
+              <w:t>only once</w:t>
+            </w:r>
+            <w:r>
+              <w:rPr>
+                <w:lang w:val="en-US"/>
+              </w:rPr>
+              <w:t>)</w:t>
+            </w:r>
+          </w:p>
+        </w:tc>
+      </w:tr>
+      <w:tr>
+        <w:trPr>
+          <w:tblCellSpacing w:w="15" w:type="dxa"/>
+        </w:trPr>
+        <w:tc>
+          <w:tcPr>
+            <w:tcW w:w="0" w:type="auto"/>
+            <w:vAlign w:val="center"/>
+            <w:hideMark/>
+          </w:tcPr>
+          <w:p>
+            <w:pPr>
+              <w:rPr>
+                <w:lang w:val="en-US"/>
+              </w:rPr>
+            </w:pPr>
+            <w:r>
+              <w:rPr>
+                <w:b/>
+                <w:bCs/>
+                <w:lang w:val="en-US"/>
+              </w:rPr>
+              <w:t>Closes connection?</w:t>
+            </w:r>
+          </w:p>
+        </w:tc>
+        <w:tc>
+          <w:tcPr>
+            <w:tcW w:w="0" w:type="auto"/>
+            <w:vAlign w:val="center"/>
+            <w:hideMark/>
+          </w:tcPr>
+          <w:p>
+            <w:pPr>
+              <w:rPr>
+                <w:lang w:val="en-US"/>
+              </w:rPr>
+            </w:pPr>
+            <w:r>
+              <w:rPr>
+                <w:lang w:val="en-US"/>
+              </w:rPr>
+              <w:t xml:space="preserve"> No</w:t>
+            </w:r>
+          </w:p>
+        </w:tc>
+        <w:tc>
+          <w:tcPr>
+            <w:tcW w:w="0" w:type="auto"/>
+            <w:vAlign w:val="center"/>
+            <w:hideMark/>
+          </w:tcPr>
+          <w:p>
+            <w:pPr>
+              <w:rPr>
+                <w:lang w:val="en-US"/>
+              </w:rPr>
+            </w:pPr>
+            <w:r>
+              <w:rPr>
+                <w:lang w:val="en-US"/>
+              </w:rPr>
+              <w:t xml:space="preserve"> Yes</w:t>
+            </w:r>
+          </w:p>
+        </w:tc>
+      </w:tr>
+      <w:tr>
+        <w:trPr>
+          <w:tblCellSpacing w:w="15" w:type="dxa"/>
+        </w:trPr>
+        <w:tc>
+          <w:tcPr>
+            <w:tcW w:w="0" w:type="auto"/>
+            <w:vAlign w:val="center"/>
+            <w:hideMark/>
+          </w:tcPr>
+          <w:p>
+            <w:pPr>
+              <w:rPr>
+                <w:lang w:val="en-US"/>
+              </w:rPr>
+            </w:pPr>
+            <w:r>
+              <w:rPr>
+                <w:b/>
+                <w:bCs/>
+                <w:lang w:val="en-US"/>
+              </w:rPr>
+              <w:t>Required?</w:t>
+            </w:r>
+          </w:p>
+        </w:tc>
+        <w:tc>
+          <w:tcPr>
+            <w:tcW w:w="0" w:type="auto"/>
+            <w:vAlign w:val="center"/>
+            <w:hideMark/>
+          </w:tcPr>
+          <w:p>
+            <w:pPr>
+              <w:rPr>
+                <w:lang w:val="en-US"/>
+              </w:rPr>
+            </w:pPr>
+            <w:r>
+              <w:rPr>
+                <w:lang w:val="en-US"/>
+              </w:rPr>
+              <w:t>No</w:t>
+            </w:r>
+          </w:p>
+        </w:tc>
+        <w:tc>
+          <w:tcPr>
+            <w:tcW w:w="0" w:type="auto"/>
+            <w:vAlign w:val="center"/>
+            <w:hideMark/>
+          </w:tcPr>
+          <w:p>
+            <w:pPr>
+              <w:rPr>
+                <w:lang w:val="en-US"/>
+              </w:rPr>
+            </w:pPr>
+            <w:r>
+              <w:rPr>
+                <w:lang w:val="en-US"/>
+              </w:rPr>
+              <w:t xml:space="preserve"> Yes</w:t>
+            </w:r>
+          </w:p>
+        </w:tc>
+      </w:tr>
+    </w:tbl>
+    <w:p/>
+    <w:p/>
+    <w:p/>
+    <w:p>
+      <w:r>
+        <w:rPr>
+          <w:b/>
+          <w:bCs/>
+        </w:rPr>
+        <w:t>Q</w:t>
+      </w:r>
+      <w:r>
+        <w:rPr>
+          <w:b/>
+          <w:bCs/>
+        </w:rPr>
+        <w:t>3</w:t>
+      </w:r>
+      <w:r>
+        <w:rPr>
+          <w:b/>
+          <w:bCs/>
+        </w:rPr>
+        <w:t xml:space="preserve"> –</w:t>
+      </w:r>
+      <w:r>
+        <w:t xml:space="preserve"> </w:t>
+      </w:r>
+      <w:r>
+        <w:t xml:space="preserve">What do you think will happen if </w:t>
+      </w:r>
+      <w:proofErr w:type="gramStart"/>
+      <w:r>
+        <w:rPr>
+          <w:rStyle w:val="HTMLCode"/>
+        </w:rPr>
+        <w:t>res.end(</w:t>
+      </w:r>
+      <w:proofErr w:type="gramEnd"/>
+      <w:r>
+        <w:rPr>
+          <w:rStyle w:val="HTMLCode"/>
+        </w:rPr>
+        <w:t>)</w:t>
+      </w:r>
+      <w:r>
+        <w:t xml:space="preserve"> is not called at all?</w:t>
+      </w:r>
+    </w:p>
+    <w:p>
+      <w:proofErr w:type="gramStart"/>
+      <w:r>
+        <w:t>Answer :</w:t>
+      </w:r>
+      <w:proofErr w:type="gramEnd"/>
+      <w:r>
+        <w:t xml:space="preserve"> </w:t>
+      </w:r>
+      <w:r>
+        <w:t xml:space="preserve">The client (browser/curl) will </w:t>
+      </w:r>
+      <w:r>
+        <w:rPr>
+          <w:b/>
+          <w:bCs/>
+        </w:rPr>
+        <w:t>hang indefinitely</w:t>
+      </w:r>
+      <w:r>
+        <w:t xml:space="preserve">  the request stays open waiting for the server to finish. Eventually it times out. The connection is never released, which can exhaust server resources under load.</w:t>
+      </w:r>
+    </w:p>
+    <w:p/>
+    <w:p/>
+    <w:p>
+      <w:r>
+        <w:rPr>
+          <w:b/>
+          <w:bCs/>
+        </w:rPr>
+        <w:t>Q</w:t>
+      </w:r>
+      <w:r>
+        <w:rPr>
+          <w:b/>
+          <w:bCs/>
+        </w:rPr>
+        <w:t>4</w:t>
+      </w:r>
+      <w:r>
+        <w:rPr>
+          <w:b/>
+          <w:bCs/>
+        </w:rPr>
+        <w:t xml:space="preserve"> –</w:t>
+      </w:r>
+      <w:r>
+        <w:t xml:space="preserve"> </w:t>
+      </w:r>
+      <w:r>
+        <w:t xml:space="preserve">Why do we use </w:t>
+      </w:r>
+      <w:proofErr w:type="gramStart"/>
+      <w:r>
+        <w:rPr>
+          <w:rStyle w:val="HTMLCode"/>
+        </w:rPr>
+        <w:t>http.createServer</w:t>
+      </w:r>
+      <w:proofErr w:type="gramEnd"/>
+      <w:r>
+        <w:rPr>
+          <w:rStyle w:val="HTMLCode"/>
+        </w:rPr>
+        <w:t>()</w:t>
+      </w:r>
+      <w:r>
+        <w:t xml:space="preserve"> instead of just calling a function directly?</w:t>
+      </w:r>
+    </w:p>
+    <w:p>
+      <w:pPr>
+        <w:rPr>
+          <w:lang w:val="en-US"/>
+        </w:rPr>
+      </w:pPr>
+      <w:proofErr w:type="spellStart"/>
+      <w:proofErr w:type="gramStart"/>
+      <w:r>
+        <w:rPr>
+          <w:lang w:val="en-US"/>
+        </w:rPr>
+        <w:t>http.createServer</w:t>
+      </w:r>
+      <w:proofErr w:type="spellEnd"/>
+      <w:proofErr w:type="gramEnd"/>
+      <w:r>
+        <w:rPr>
+          <w:lang w:val="en-US"/>
+        </w:rPr>
+        <w:t xml:space="preserve">() sets up a </w:t>
+      </w:r>
+      <w:r>
+        <w:rPr>
+          <w:b/>
+          <w:bCs/>
+          <w:lang w:val="en-US"/>
+        </w:rPr>
+        <w:t>persistent TCP listener</w:t>
+      </w:r>
+      <w:r>
+        <w:rPr>
+          <w:lang w:val="en-US"/>
+        </w:rPr>
+        <w:t xml:space="preserve"> that:</w:t>
+      </w:r>
+    </w:p>
+    <w:p>
+      <w:pPr>
+        <w:numPr>
+          <w:ilvl w:val="0"/>
+          <w:numId w:val="22"/>
+        </w:numPr>
+        <w:rPr>
+          <w:lang w:val="en-US"/>
+        </w:rPr>
+      </w:pPr>
+      <w:r>
+        <w:rPr>
+          <w:lang w:val="en-US"/>
+        </w:rPr>
+        <w:t>Accepts multiple simultaneous connections</w:t>
+      </w:r>
+    </w:p>
+    <w:p>
+      <w:pPr>
+        <w:numPr>
+          <w:ilvl w:val="0"/>
+          <w:numId w:val="22"/>
+        </w:numPr>
+        <w:rPr>
+          <w:lang w:val="en-US"/>
+        </w:rPr>
+      </w:pPr>
+      <w:r>
+        <w:rPr>
+          <w:lang w:val="en-US"/>
+        </w:rPr>
+        <w:t>Parses raw HTTP into req/res objects for you</w:t>
+      </w:r>
+    </w:p>
+    <w:p>
+      <w:pPr>
+        <w:numPr>
+          <w:ilvl w:val="0"/>
+          <w:numId w:val="22"/>
+        </w:numPr>
+        <w:rPr>
+          <w:lang w:val="en-US"/>
+        </w:rPr>
+      </w:pPr>
+      <w:r>
+        <w:rPr>
+          <w:lang w:val="en-US"/>
+        </w:rPr>
+        <w:t>Keeps running and handles new requests automatically</w:t>
+      </w:r>
+    </w:p>
+    <w:p>
+      <w:pPr>
+        <w:rPr>
+          <w:lang w:val="en-US"/>
+        </w:rPr>
+      </w:pPr>
+      <w:r>
+        <w:rPr>
+          <w:lang w:val="en-US"/>
+        </w:rPr>
+        <w:t>A plain function runs once and exits — it has no concept of a network socket, ports, or HTTP protocol handling.</w:t>
+      </w:r>
+    </w:p>
+    <w:p/>
+    <w:p>
+      <w:r>
+        <w:t xml:space="preserve"> </w:t>
+      </w:r>
+    </w:p>
+    <w:p/>
+    <w:p>
+      <w:r>
+        <w:rPr>
+          <w:b/>
+          <w:bCs/>
+          <w:lang w:val="en-US"/>
+        </w:rPr>
         <w:t>Q5 –</w:t>
       </w:r>
       <w:r>
@@ -1592,7 +2438,6 @@
         <w:pStyle w:val="Heading1"/>
       </w:pPr>
       <w:r>
-        <w:lastRenderedPageBreak/>
         <w:t xml:space="preserve">EXERCISE 2 </w:t>
       </w:r>
       <w:r>
@@ -2275,6 +3120,19 @@
     </w:p>
     <w:p>
       <w:pPr>
+        <w:pStyle w:val="ListParagraph"/>
+        <w:spacing w:before="100" w:beforeAutospacing="1" w:after="100" w:afterAutospacing="1" w:line="276" w:lineRule="auto"/>
+        <w:ind w:left="1440"/>
+      </w:pPr>
+      <w:r>
+        <w:t>It will go to the else statement that will show text plain about the 404-page is not found</w:t>
+      </w:r>
+      <w:r>
+        <w:t>.</w:t>
+      </w:r>
+    </w:p>
+    <w:p>
+      <w:pPr>
         <w:numPr>
           <w:ilvl w:val="0"/>
           <w:numId w:val="15"/>
@@ -2295,6 +3153,8 @@
       <w:r>
         <w:t xml:space="preserve"> and </w:t>
       </w:r>
+      <w:proofErr w:type="spellStart"/>
+      <w:proofErr w:type="gramStart"/>
       <w:r>
         <w:rPr>
           <w:rFonts w:ascii="Courier New" w:hAnsi="Courier New" w:cs="Courier New"/>
@@ -2303,9 +3163,33 @@
         </w:rPr>
         <w:t>req.method</w:t>
       </w:r>
+      <w:proofErr w:type="spellEnd"/>
+      <w:proofErr w:type="gramEnd"/>
       <w:r>
         <w:t>?</w:t>
       </w:r>
+    </w:p>
+    <w:p>
+      <w:pPr>
+        <w:spacing w:before="100" w:beforeAutospacing="1" w:after="100" w:afterAutospacing="1" w:line="276" w:lineRule="auto"/>
+        <w:ind w:left="720"/>
+      </w:pPr>
+      <w:r>
+        <w:t xml:space="preserve">We just want to know about current </w:t>
+      </w:r>
+      <w:proofErr w:type="spellStart"/>
+      <w:r>
+        <w:t>url</w:t>
+      </w:r>
+      <w:proofErr w:type="spellEnd"/>
+      <w:r>
+        <w:t xml:space="preserve"> and what method right </w:t>
+      </w:r>
+      <w:proofErr w:type="gramStart"/>
+      <w:r>
+        <w:t>now .</w:t>
+      </w:r>
+      <w:proofErr w:type="gramEnd"/>
     </w:p>
     <w:p>
       <w:pPr>
@@ -2332,6 +3216,15 @@
     </w:p>
     <w:p>
       <w:pPr>
+        <w:spacing w:before="100" w:beforeAutospacing="1" w:after="100" w:afterAutospacing="1" w:line="276" w:lineRule="auto"/>
+        <w:ind w:left="720"/>
+      </w:pPr>
+      <w:r>
+        <w:t>I used the text/html for using in html format</w:t>
+      </w:r>
+    </w:p>
+    <w:p>
+      <w:pPr>
         <w:numPr>
           <w:ilvl w:val="0"/>
           <w:numId w:val="15"/>
@@ -2344,6 +3237,180 @@
     </w:p>
     <w:p>
       <w:pPr>
+        <w:pStyle w:val="font-claude-response-body"/>
+        <w:ind w:left="720"/>
+      </w:pPr>
+      <w:r>
+        <w:t xml:space="preserve">As your app grows you would have to keep adding more and more </w:t>
+      </w:r>
+      <w:r>
+        <w:rPr>
+          <w:rStyle w:val="HTMLCode"/>
+        </w:rPr>
+        <w:t>else if</w:t>
+      </w:r>
+      <w:r>
+        <w:t xml:space="preserve"> or </w:t>
+      </w:r>
+      <w:r>
+        <w:rPr>
+          <w:rStyle w:val="HTMLCode"/>
+        </w:rPr>
+        <w:t>case</w:t>
+      </w:r>
+      <w:r>
+        <w:t xml:space="preserve"> blocks in one single file. This creates several problems:</w:t>
+      </w:r>
+    </w:p>
+    <w:p>
+      <w:pPr>
+        <w:pStyle w:val="whitespace-normal"/>
+        <w:numPr>
+          <w:ilvl w:val="1"/>
+          <w:numId w:val="15"/>
+        </w:numPr>
+      </w:pPr>
+      <w:r>
+        <w:t xml:space="preserve">The file becomes </w:t>
+      </w:r>
+      <w:r>
+        <w:rPr>
+          <w:rStyle w:val="Strong"/>
+        </w:rPr>
+        <w:t>very long and hard to read</w:t>
+      </w:r>
+    </w:p>
+    <w:p>
+      <w:pPr>
+        <w:pStyle w:val="whitespace-normal"/>
+        <w:numPr>
+          <w:ilvl w:val="1"/>
+          <w:numId w:val="15"/>
+        </w:numPr>
+      </w:pPr>
+      <w:r>
+        <w:rPr>
+          <w:rStyle w:val="Strong"/>
+        </w:rPr>
+        <w:t>Finding and editing</w:t>
+      </w:r>
+      <w:r>
+        <w:t xml:space="preserve"> a specific route takes more time</w:t>
+      </w:r>
+    </w:p>
+    <w:p>
+      <w:pPr>
+        <w:pStyle w:val="whitespace-normal"/>
+        <w:numPr>
+          <w:ilvl w:val="1"/>
+          <w:numId w:val="15"/>
+        </w:numPr>
+      </w:pPr>
+      <w:r>
+        <w:t xml:space="preserve">If two developers work on the same </w:t>
+      </w:r>
+      <w:proofErr w:type="gramStart"/>
+      <w:r>
+        <w:t>file</w:t>
+      </w:r>
+      <w:proofErr w:type="gramEnd"/>
+      <w:r>
+        <w:t xml:space="preserve"> they will constantly have </w:t>
+      </w:r>
+      <w:r>
+        <w:rPr>
+          <w:rStyle w:val="Strong"/>
+        </w:rPr>
+        <w:t>conflicts</w:t>
+      </w:r>
+    </w:p>
+    <w:p>
+      <w:pPr>
+        <w:pStyle w:val="whitespace-normal"/>
+        <w:numPr>
+          <w:ilvl w:val="1"/>
+          <w:numId w:val="15"/>
+        </w:numPr>
+      </w:pPr>
+      <w:r>
+        <w:t xml:space="preserve">You also have to </w:t>
+      </w:r>
+      <w:r>
+        <w:rPr>
+          <w:rStyle w:val="Strong"/>
+        </w:rPr>
+        <w:t>manually check</w:t>
+      </w:r>
+      <w:r>
+        <w:t xml:space="preserve"> </w:t>
+      </w:r>
+      <w:proofErr w:type="spellStart"/>
+      <w:proofErr w:type="gramStart"/>
+      <w:r>
+        <w:rPr>
+          <w:rStyle w:val="HTMLCode"/>
+        </w:rPr>
+        <w:t>req.method</w:t>
+      </w:r>
+      <w:proofErr w:type="spellEnd"/>
+      <w:proofErr w:type="gramEnd"/>
+      <w:r>
+        <w:t xml:space="preserve"> every time for GET, POST, etc.</w:t>
+      </w:r>
+    </w:p>
+    <w:p>
+      <w:pPr>
+        <w:pStyle w:val="whitespace-normal"/>
+        <w:numPr>
+          <w:ilvl w:val="1"/>
+          <w:numId w:val="15"/>
+        </w:numPr>
+      </w:pPr>
+      <w:r>
+        <w:rPr>
+          <w:rStyle w:val="Strong"/>
+        </w:rPr>
+        <w:t>No grouping</w:t>
+      </w:r>
+      <w:r>
+        <w:t xml:space="preserve"> — all routes like </w:t>
+      </w:r>
+      <w:r>
+        <w:rPr>
+          <w:rStyle w:val="HTMLCode"/>
+        </w:rPr>
+        <w:t>/products</w:t>
+      </w:r>
+      <w:r>
+        <w:t xml:space="preserve">, </w:t>
+      </w:r>
+      <w:r>
+        <w:rPr>
+          <w:rStyle w:val="HTMLCode"/>
+        </w:rPr>
+        <w:t>/products/1</w:t>
+      </w:r>
+      <w:r>
+        <w:t xml:space="preserve">, </w:t>
+      </w:r>
+      <w:r>
+        <w:rPr>
+          <w:rStyle w:val="HTMLCode"/>
+        </w:rPr>
+        <w:t>/products/edit</w:t>
+      </w:r>
+      <w:r>
+        <w:t xml:space="preserve"> are scattered with no organization</w:t>
+      </w:r>
+    </w:p>
+    <w:p>
+      <w:pPr>
+        <w:spacing w:before="100" w:beforeAutospacing="1" w:after="100" w:afterAutospacing="1" w:line="276" w:lineRule="auto"/>
+        <w:ind w:left="720"/>
+      </w:pPr>
+    </w:p>
+    <w:p>
+      <w:pPr>
         <w:numPr>
           <w:ilvl w:val="0"/>
           <w:numId w:val="15"/>
@@ -2352,6 +3419,906 @@
       </w:pPr>
       <w:r>
         <w:t>What benefits might a framework offer to simplify this logic?</w:t>
+      </w:r>
+    </w:p>
+    <w:p>
+      <w:pPr>
+        <w:spacing w:before="100" w:beforeAutospacing="1" w:after="100" w:afterAutospacing="1"/>
+        <w:ind w:left="720"/>
+        <w:rPr>
+          <w:rFonts w:ascii="Times New Roman" w:hAnsi="Times New Roman"/>
+          <w:lang w:val="en-US" w:eastAsia="en-US"/>
+        </w:rPr>
+      </w:pPr>
+      <w:r>
+        <w:rPr>
+          <w:rFonts w:ascii="Times New Roman" w:hAnsi="Times New Roman"/>
+          <w:lang w:val="en-US" w:eastAsia="en-US"/>
+        </w:rPr>
+        <w:t xml:space="preserve">A framework like </w:t>
+      </w:r>
+      <w:r>
+        <w:rPr>
+          <w:rFonts w:ascii="Times New Roman" w:hAnsi="Times New Roman"/>
+          <w:b/>
+          <w:bCs/>
+          <w:lang w:val="en-US" w:eastAsia="en-US"/>
+        </w:rPr>
+        <w:t>Express.js</w:t>
+      </w:r>
+      <w:r>
+        <w:rPr>
+          <w:rFonts w:ascii="Times New Roman" w:hAnsi="Times New Roman"/>
+          <w:lang w:val="en-US" w:eastAsia="en-US"/>
+        </w:rPr>
+        <w:t xml:space="preserve"> removes the need to manually manage routing, method checking, and error handling:</w:t>
+      </w:r>
+    </w:p>
+    <w:p>
+      <w:pPr>
+        <w:ind w:left="720"/>
+        <w:rPr>
+          <w:rFonts w:ascii="Times New Roman" w:hAnsi="Times New Roman"/>
+          <w:lang w:val="en-US" w:eastAsia="en-US"/>
+        </w:rPr>
+      </w:pPr>
+      <w:proofErr w:type="spellStart"/>
+      <w:r>
+        <w:rPr>
+          <w:rFonts w:ascii="Times New Roman" w:hAnsi="Times New Roman"/>
+          <w:lang w:val="en-US" w:eastAsia="en-US"/>
+        </w:rPr>
+        <w:t>js</w:t>
+      </w:r>
+      <w:proofErr w:type="spellEnd"/>
+    </w:p>
+    <w:p>
+      <w:pPr>
+        <w:tabs>
+          <w:tab w:val="left" w:pos="916"/>
+          <w:tab w:val="left" w:pos="1832"/>
+          <w:tab w:val="left" w:pos="2748"/>
+          <w:tab w:val="left" w:pos="3664"/>
+          <w:tab w:val="left" w:pos="4580"/>
+          <w:tab w:val="left" w:pos="5496"/>
+          <w:tab w:val="left" w:pos="6412"/>
+          <w:tab w:val="left" w:pos="7328"/>
+          <w:tab w:val="left" w:pos="8244"/>
+          <w:tab w:val="left" w:pos="9160"/>
+          <w:tab w:val="left" w:pos="10076"/>
+          <w:tab w:val="left" w:pos="10992"/>
+          <w:tab w:val="left" w:pos="11908"/>
+          <w:tab w:val="left" w:pos="12824"/>
+          <w:tab w:val="left" w:pos="13740"/>
+          <w:tab w:val="left" w:pos="14656"/>
+        </w:tabs>
+        <w:ind w:left="916"/>
+        <w:rPr>
+          <w:rFonts w:ascii="var(--font-mono)" w:hAnsi="var(--font-mono)" w:cs="Courier New"/>
+          <w:color w:val="EAECF0"/>
+          <w:sz w:val="20"/>
+          <w:szCs w:val="20"/>
+          <w:lang w:val="en-US" w:eastAsia="en-US"/>
+        </w:rPr>
+      </w:pPr>
+      <w:proofErr w:type="spellStart"/>
+      <w:proofErr w:type="gramStart"/>
+      <w:r>
+        <w:rPr>
+          <w:rFonts w:ascii="var(--font-mono)" w:hAnsi="var(--font-mono)" w:cs="Courier New"/>
+          <w:color w:val="EAECF0"/>
+          <w:sz w:val="20"/>
+          <w:szCs w:val="20"/>
+          <w:lang w:val="en-US" w:eastAsia="en-US"/>
+        </w:rPr>
+        <w:t>app</w:t>
+      </w:r>
+      <w:r>
+        <w:rPr>
+          <w:rFonts w:ascii="var(--font-mono)" w:hAnsi="var(--font-mono)" w:cs="Courier New"/>
+          <w:color w:val="D3D7DE"/>
+          <w:sz w:val="20"/>
+          <w:szCs w:val="20"/>
+          <w:lang w:val="en-US" w:eastAsia="en-US"/>
+        </w:rPr>
+        <w:t>.</w:t>
+      </w:r>
+      <w:r>
+        <w:rPr>
+          <w:rFonts w:ascii="var(--font-mono)" w:hAnsi="var(--font-mono)" w:cs="Courier New"/>
+          <w:color w:val="70B8FF"/>
+          <w:sz w:val="20"/>
+          <w:szCs w:val="20"/>
+          <w:lang w:val="en-US" w:eastAsia="en-US"/>
+        </w:rPr>
+        <w:t>get</w:t>
+      </w:r>
+      <w:proofErr w:type="spellEnd"/>
+      <w:r>
+        <w:rPr>
+          <w:rFonts w:ascii="var(--font-mono)" w:hAnsi="var(--font-mono)" w:cs="Courier New"/>
+          <w:color w:val="D3D7DE"/>
+          <w:sz w:val="20"/>
+          <w:szCs w:val="20"/>
+          <w:lang w:val="en-US" w:eastAsia="en-US"/>
+        </w:rPr>
+        <w:t>(</w:t>
+      </w:r>
+      <w:proofErr w:type="gramEnd"/>
+      <w:r>
+        <w:rPr>
+          <w:rFonts w:ascii="var(--font-mono)" w:hAnsi="var(--font-mono)" w:cs="Courier New"/>
+          <w:color w:val="9BE963"/>
+          <w:sz w:val="20"/>
+          <w:szCs w:val="20"/>
+          <w:lang w:val="en-US" w:eastAsia="en-US"/>
+        </w:rPr>
+        <w:t>'/about'</w:t>
+      </w:r>
+      <w:r>
+        <w:rPr>
+          <w:rFonts w:ascii="var(--font-mono)" w:hAnsi="var(--font-mono)" w:cs="Courier New"/>
+          <w:color w:val="D3D7DE"/>
+          <w:sz w:val="20"/>
+          <w:szCs w:val="20"/>
+          <w:lang w:val="en-US" w:eastAsia="en-US"/>
+        </w:rPr>
+        <w:t>,</w:t>
+      </w:r>
+      <w:r>
+        <w:rPr>
+          <w:rFonts w:ascii="var(--font-mono)" w:hAnsi="var(--font-mono)" w:cs="Courier New"/>
+          <w:color w:val="EAECF0"/>
+          <w:sz w:val="20"/>
+          <w:szCs w:val="20"/>
+          <w:lang w:val="en-US" w:eastAsia="en-US"/>
+        </w:rPr>
+        <w:t xml:space="preserve"> </w:t>
+      </w:r>
+      <w:r>
+        <w:rPr>
+          <w:rFonts w:ascii="var(--font-mono)" w:hAnsi="var(--font-mono)" w:cs="Courier New"/>
+          <w:color w:val="D3D7DE"/>
+          <w:sz w:val="20"/>
+          <w:szCs w:val="20"/>
+          <w:lang w:val="en-US" w:eastAsia="en-US"/>
+        </w:rPr>
+        <w:t>(</w:t>
+      </w:r>
+      <w:r>
+        <w:rPr>
+          <w:rFonts w:ascii="var(--font-mono)" w:hAnsi="var(--font-mono)" w:cs="Courier New"/>
+          <w:color w:val="F7AB5F"/>
+          <w:sz w:val="20"/>
+          <w:szCs w:val="20"/>
+          <w:lang w:val="en-US" w:eastAsia="en-US"/>
+        </w:rPr>
+        <w:t>req</w:t>
+      </w:r>
+      <w:r>
+        <w:rPr>
+          <w:rFonts w:ascii="var(--font-mono)" w:hAnsi="var(--font-mono)" w:cs="Courier New"/>
+          <w:color w:val="D3D7DE"/>
+          <w:sz w:val="20"/>
+          <w:szCs w:val="20"/>
+          <w:lang w:val="en-US" w:eastAsia="en-US"/>
+        </w:rPr>
+        <w:t>,</w:t>
+      </w:r>
+      <w:r>
+        <w:rPr>
+          <w:rFonts w:ascii="var(--font-mono)" w:hAnsi="var(--font-mono)" w:cs="Courier New"/>
+          <w:color w:val="F7AB5F"/>
+          <w:sz w:val="20"/>
+          <w:szCs w:val="20"/>
+          <w:lang w:val="en-US" w:eastAsia="en-US"/>
+        </w:rPr>
+        <w:t xml:space="preserve"> res</w:t>
+      </w:r>
+      <w:r>
+        <w:rPr>
+          <w:rFonts w:ascii="var(--font-mono)" w:hAnsi="var(--font-mono)" w:cs="Courier New"/>
+          <w:color w:val="D3D7DE"/>
+          <w:sz w:val="20"/>
+          <w:szCs w:val="20"/>
+          <w:lang w:val="en-US" w:eastAsia="en-US"/>
+        </w:rPr>
+        <w:t>)</w:t>
+      </w:r>
+      <w:r>
+        <w:rPr>
+          <w:rFonts w:ascii="var(--font-mono)" w:hAnsi="var(--font-mono)" w:cs="Courier New"/>
+          <w:color w:val="EAECF0"/>
+          <w:sz w:val="20"/>
+          <w:szCs w:val="20"/>
+          <w:lang w:val="en-US" w:eastAsia="en-US"/>
+        </w:rPr>
+        <w:t xml:space="preserve"> =&gt; </w:t>
+      </w:r>
+      <w:proofErr w:type="spellStart"/>
+      <w:r>
+        <w:rPr>
+          <w:rFonts w:ascii="var(--font-mono)" w:hAnsi="var(--font-mono)" w:cs="Courier New"/>
+          <w:color w:val="EAECF0"/>
+          <w:sz w:val="20"/>
+          <w:szCs w:val="20"/>
+          <w:lang w:val="en-US" w:eastAsia="en-US"/>
+        </w:rPr>
+        <w:t>res</w:t>
+      </w:r>
+      <w:r>
+        <w:rPr>
+          <w:rFonts w:ascii="var(--font-mono)" w:hAnsi="var(--font-mono)" w:cs="Courier New"/>
+          <w:color w:val="D3D7DE"/>
+          <w:sz w:val="20"/>
+          <w:szCs w:val="20"/>
+          <w:lang w:val="en-US" w:eastAsia="en-US"/>
+        </w:rPr>
+        <w:t>.</w:t>
+      </w:r>
+      <w:r>
+        <w:rPr>
+          <w:rFonts w:ascii="var(--font-mono)" w:hAnsi="var(--font-mono)" w:cs="Courier New"/>
+          <w:color w:val="70B8FF"/>
+          <w:sz w:val="20"/>
+          <w:szCs w:val="20"/>
+          <w:lang w:val="en-US" w:eastAsia="en-US"/>
+        </w:rPr>
+        <w:t>send</w:t>
+      </w:r>
+      <w:proofErr w:type="spellEnd"/>
+      <w:r>
+        <w:rPr>
+          <w:rFonts w:ascii="var(--font-mono)" w:hAnsi="var(--font-mono)" w:cs="Courier New"/>
+          <w:color w:val="D3D7DE"/>
+          <w:sz w:val="20"/>
+          <w:szCs w:val="20"/>
+          <w:lang w:val="en-US" w:eastAsia="en-US"/>
+        </w:rPr>
+        <w:t>(</w:t>
+      </w:r>
+      <w:r>
+        <w:rPr>
+          <w:rFonts w:ascii="var(--font-mono)" w:hAnsi="var(--font-mono)" w:cs="Courier New"/>
+          <w:color w:val="9BE963"/>
+          <w:sz w:val="20"/>
+          <w:szCs w:val="20"/>
+          <w:lang w:val="en-US" w:eastAsia="en-US"/>
+        </w:rPr>
+        <w:t>'About Us'</w:t>
+      </w:r>
+      <w:r>
+        <w:rPr>
+          <w:rFonts w:ascii="var(--font-mono)" w:hAnsi="var(--font-mono)" w:cs="Courier New"/>
+          <w:color w:val="D3D7DE"/>
+          <w:sz w:val="20"/>
+          <w:szCs w:val="20"/>
+          <w:lang w:val="en-US" w:eastAsia="en-US"/>
+        </w:rPr>
+        <w:t>));</w:t>
+      </w:r>
+    </w:p>
+    <w:p>
+      <w:pPr>
+        <w:tabs>
+          <w:tab w:val="left" w:pos="916"/>
+          <w:tab w:val="left" w:pos="1832"/>
+          <w:tab w:val="left" w:pos="2748"/>
+          <w:tab w:val="left" w:pos="3664"/>
+          <w:tab w:val="left" w:pos="4580"/>
+          <w:tab w:val="left" w:pos="5496"/>
+          <w:tab w:val="left" w:pos="6412"/>
+          <w:tab w:val="left" w:pos="7328"/>
+          <w:tab w:val="left" w:pos="8244"/>
+          <w:tab w:val="left" w:pos="9160"/>
+          <w:tab w:val="left" w:pos="10076"/>
+          <w:tab w:val="left" w:pos="10992"/>
+          <w:tab w:val="left" w:pos="11908"/>
+          <w:tab w:val="left" w:pos="12824"/>
+          <w:tab w:val="left" w:pos="13740"/>
+          <w:tab w:val="left" w:pos="14656"/>
+        </w:tabs>
+        <w:ind w:left="916"/>
+        <w:rPr>
+          <w:rFonts w:ascii="var(--font-mono)" w:hAnsi="var(--font-mono)" w:cs="Courier New"/>
+          <w:color w:val="EAECF0"/>
+          <w:sz w:val="20"/>
+          <w:szCs w:val="20"/>
+          <w:lang w:val="en-US" w:eastAsia="en-US"/>
+        </w:rPr>
+      </w:pPr>
+      <w:proofErr w:type="spellStart"/>
+      <w:proofErr w:type="gramStart"/>
+      <w:r>
+        <w:rPr>
+          <w:rFonts w:ascii="var(--font-mono)" w:hAnsi="var(--font-mono)" w:cs="Courier New"/>
+          <w:color w:val="EAECF0"/>
+          <w:sz w:val="20"/>
+          <w:szCs w:val="20"/>
+          <w:lang w:val="en-US" w:eastAsia="en-US"/>
+        </w:rPr>
+        <w:t>app</w:t>
+      </w:r>
+      <w:r>
+        <w:rPr>
+          <w:rFonts w:ascii="var(--font-mono)" w:hAnsi="var(--font-mono)" w:cs="Courier New"/>
+          <w:color w:val="D3D7DE"/>
+          <w:sz w:val="20"/>
+          <w:szCs w:val="20"/>
+          <w:lang w:val="en-US" w:eastAsia="en-US"/>
+        </w:rPr>
+        <w:t>.</w:t>
+      </w:r>
+      <w:r>
+        <w:rPr>
+          <w:rFonts w:ascii="var(--font-mono)" w:hAnsi="var(--font-mono)" w:cs="Courier New"/>
+          <w:color w:val="70B8FF"/>
+          <w:sz w:val="20"/>
+          <w:szCs w:val="20"/>
+          <w:lang w:val="en-US" w:eastAsia="en-US"/>
+        </w:rPr>
+        <w:t>post</w:t>
+      </w:r>
+      <w:proofErr w:type="spellEnd"/>
+      <w:r>
+        <w:rPr>
+          <w:rFonts w:ascii="var(--font-mono)" w:hAnsi="var(--font-mono)" w:cs="Courier New"/>
+          <w:color w:val="D3D7DE"/>
+          <w:sz w:val="20"/>
+          <w:szCs w:val="20"/>
+          <w:lang w:val="en-US" w:eastAsia="en-US"/>
+        </w:rPr>
+        <w:t>(</w:t>
+      </w:r>
+      <w:proofErr w:type="gramEnd"/>
+      <w:r>
+        <w:rPr>
+          <w:rFonts w:ascii="var(--font-mono)" w:hAnsi="var(--font-mono)" w:cs="Courier New"/>
+          <w:color w:val="9BE963"/>
+          <w:sz w:val="20"/>
+          <w:szCs w:val="20"/>
+          <w:lang w:val="en-US" w:eastAsia="en-US"/>
+        </w:rPr>
+        <w:t>'/about'</w:t>
+      </w:r>
+      <w:r>
+        <w:rPr>
+          <w:rFonts w:ascii="var(--font-mono)" w:hAnsi="var(--font-mono)" w:cs="Courier New"/>
+          <w:color w:val="D3D7DE"/>
+          <w:sz w:val="20"/>
+          <w:szCs w:val="20"/>
+          <w:lang w:val="en-US" w:eastAsia="en-US"/>
+        </w:rPr>
+        <w:t>,</w:t>
+      </w:r>
+      <w:r>
+        <w:rPr>
+          <w:rFonts w:ascii="var(--font-mono)" w:hAnsi="var(--font-mono)" w:cs="Courier New"/>
+          <w:color w:val="EAECF0"/>
+          <w:sz w:val="20"/>
+          <w:szCs w:val="20"/>
+          <w:lang w:val="en-US" w:eastAsia="en-US"/>
+        </w:rPr>
+        <w:t xml:space="preserve"> </w:t>
+      </w:r>
+      <w:r>
+        <w:rPr>
+          <w:rFonts w:ascii="var(--font-mono)" w:hAnsi="var(--font-mono)" w:cs="Courier New"/>
+          <w:color w:val="D3D7DE"/>
+          <w:sz w:val="20"/>
+          <w:szCs w:val="20"/>
+          <w:lang w:val="en-US" w:eastAsia="en-US"/>
+        </w:rPr>
+        <w:t>(</w:t>
+      </w:r>
+      <w:r>
+        <w:rPr>
+          <w:rFonts w:ascii="var(--font-mono)" w:hAnsi="var(--font-mono)" w:cs="Courier New"/>
+          <w:color w:val="F7AB5F"/>
+          <w:sz w:val="20"/>
+          <w:szCs w:val="20"/>
+          <w:lang w:val="en-US" w:eastAsia="en-US"/>
+        </w:rPr>
+        <w:t>req</w:t>
+      </w:r>
+      <w:r>
+        <w:rPr>
+          <w:rFonts w:ascii="var(--font-mono)" w:hAnsi="var(--font-mono)" w:cs="Courier New"/>
+          <w:color w:val="D3D7DE"/>
+          <w:sz w:val="20"/>
+          <w:szCs w:val="20"/>
+          <w:lang w:val="en-US" w:eastAsia="en-US"/>
+        </w:rPr>
+        <w:t>,</w:t>
+      </w:r>
+      <w:r>
+        <w:rPr>
+          <w:rFonts w:ascii="var(--font-mono)" w:hAnsi="var(--font-mono)" w:cs="Courier New"/>
+          <w:color w:val="F7AB5F"/>
+          <w:sz w:val="20"/>
+          <w:szCs w:val="20"/>
+          <w:lang w:val="en-US" w:eastAsia="en-US"/>
+        </w:rPr>
+        <w:t xml:space="preserve"> res</w:t>
+      </w:r>
+      <w:r>
+        <w:rPr>
+          <w:rFonts w:ascii="var(--font-mono)" w:hAnsi="var(--font-mono)" w:cs="Courier New"/>
+          <w:color w:val="D3D7DE"/>
+          <w:sz w:val="20"/>
+          <w:szCs w:val="20"/>
+          <w:lang w:val="en-US" w:eastAsia="en-US"/>
+        </w:rPr>
+        <w:t>)</w:t>
+      </w:r>
+      <w:r>
+        <w:rPr>
+          <w:rFonts w:ascii="var(--font-mono)" w:hAnsi="var(--font-mono)" w:cs="Courier New"/>
+          <w:color w:val="EAECF0"/>
+          <w:sz w:val="20"/>
+          <w:szCs w:val="20"/>
+          <w:lang w:val="en-US" w:eastAsia="en-US"/>
+        </w:rPr>
+        <w:t xml:space="preserve"> =&gt; </w:t>
+      </w:r>
+      <w:proofErr w:type="spellStart"/>
+      <w:r>
+        <w:rPr>
+          <w:rFonts w:ascii="var(--font-mono)" w:hAnsi="var(--font-mono)" w:cs="Courier New"/>
+          <w:color w:val="EAECF0"/>
+          <w:sz w:val="20"/>
+          <w:szCs w:val="20"/>
+          <w:lang w:val="en-US" w:eastAsia="en-US"/>
+        </w:rPr>
+        <w:t>res</w:t>
+      </w:r>
+      <w:r>
+        <w:rPr>
+          <w:rFonts w:ascii="var(--font-mono)" w:hAnsi="var(--font-mono)" w:cs="Courier New"/>
+          <w:color w:val="D3D7DE"/>
+          <w:sz w:val="20"/>
+          <w:szCs w:val="20"/>
+          <w:lang w:val="en-US" w:eastAsia="en-US"/>
+        </w:rPr>
+        <w:t>.</w:t>
+      </w:r>
+      <w:r>
+        <w:rPr>
+          <w:rFonts w:ascii="var(--font-mono)" w:hAnsi="var(--font-mono)" w:cs="Courier New"/>
+          <w:color w:val="70B8FF"/>
+          <w:sz w:val="20"/>
+          <w:szCs w:val="20"/>
+          <w:lang w:val="en-US" w:eastAsia="en-US"/>
+        </w:rPr>
+        <w:t>send</w:t>
+      </w:r>
+      <w:proofErr w:type="spellEnd"/>
+      <w:r>
+        <w:rPr>
+          <w:rFonts w:ascii="var(--font-mono)" w:hAnsi="var(--font-mono)" w:cs="Courier New"/>
+          <w:color w:val="D3D7DE"/>
+          <w:sz w:val="20"/>
+          <w:szCs w:val="20"/>
+          <w:lang w:val="en-US" w:eastAsia="en-US"/>
+        </w:rPr>
+        <w:t>(</w:t>
+      </w:r>
+      <w:r>
+        <w:rPr>
+          <w:rFonts w:ascii="var(--font-mono)" w:hAnsi="var(--font-mono)" w:cs="Courier New"/>
+          <w:color w:val="9BE963"/>
+          <w:sz w:val="20"/>
+          <w:szCs w:val="20"/>
+          <w:lang w:val="en-US" w:eastAsia="en-US"/>
+        </w:rPr>
+        <w:t>'Created'</w:t>
+      </w:r>
+      <w:r>
+        <w:rPr>
+          <w:rFonts w:ascii="var(--font-mono)" w:hAnsi="var(--font-mono)" w:cs="Courier New"/>
+          <w:color w:val="D3D7DE"/>
+          <w:sz w:val="20"/>
+          <w:szCs w:val="20"/>
+          <w:lang w:val="en-US" w:eastAsia="en-US"/>
+        </w:rPr>
+        <w:t>));</w:t>
+      </w:r>
+    </w:p>
+    <w:p>
+      <w:pPr>
+        <w:tabs>
+          <w:tab w:val="left" w:pos="916"/>
+          <w:tab w:val="left" w:pos="1832"/>
+          <w:tab w:val="left" w:pos="2748"/>
+          <w:tab w:val="left" w:pos="3664"/>
+          <w:tab w:val="left" w:pos="4580"/>
+          <w:tab w:val="left" w:pos="5496"/>
+          <w:tab w:val="left" w:pos="6412"/>
+          <w:tab w:val="left" w:pos="7328"/>
+          <w:tab w:val="left" w:pos="8244"/>
+          <w:tab w:val="left" w:pos="9160"/>
+          <w:tab w:val="left" w:pos="10076"/>
+          <w:tab w:val="left" w:pos="10992"/>
+          <w:tab w:val="left" w:pos="11908"/>
+          <w:tab w:val="left" w:pos="12824"/>
+          <w:tab w:val="left" w:pos="13740"/>
+          <w:tab w:val="left" w:pos="14656"/>
+        </w:tabs>
+        <w:ind w:left="916"/>
+        <w:rPr>
+          <w:rFonts w:ascii="var(--font-mono)" w:hAnsi="var(--font-mono)" w:cs="Courier New"/>
+          <w:color w:val="EAECF0"/>
+          <w:sz w:val="20"/>
+          <w:szCs w:val="20"/>
+          <w:lang w:val="en-US" w:eastAsia="en-US"/>
+        </w:rPr>
+      </w:pPr>
+      <w:proofErr w:type="spellStart"/>
+      <w:proofErr w:type="gramStart"/>
+      <w:r>
+        <w:rPr>
+          <w:rFonts w:ascii="var(--font-mono)" w:hAnsi="var(--font-mono)" w:cs="Courier New"/>
+          <w:color w:val="EAECF0"/>
+          <w:sz w:val="20"/>
+          <w:szCs w:val="20"/>
+          <w:lang w:val="en-US" w:eastAsia="en-US"/>
+        </w:rPr>
+        <w:t>app</w:t>
+      </w:r>
+      <w:r>
+        <w:rPr>
+          <w:rFonts w:ascii="var(--font-mono)" w:hAnsi="var(--font-mono)" w:cs="Courier New"/>
+          <w:color w:val="D3D7DE"/>
+          <w:sz w:val="20"/>
+          <w:szCs w:val="20"/>
+          <w:lang w:val="en-US" w:eastAsia="en-US"/>
+        </w:rPr>
+        <w:t>.</w:t>
+      </w:r>
+      <w:r>
+        <w:rPr>
+          <w:rFonts w:ascii="var(--font-mono)" w:hAnsi="var(--font-mono)" w:cs="Courier New"/>
+          <w:color w:val="70B8FF"/>
+          <w:sz w:val="20"/>
+          <w:szCs w:val="20"/>
+          <w:lang w:val="en-US" w:eastAsia="en-US"/>
+        </w:rPr>
+        <w:t>use</w:t>
+      </w:r>
+      <w:proofErr w:type="spellEnd"/>
+      <w:r>
+        <w:rPr>
+          <w:rFonts w:ascii="var(--font-mono)" w:hAnsi="var(--font-mono)" w:cs="Courier New"/>
+          <w:color w:val="D3D7DE"/>
+          <w:sz w:val="20"/>
+          <w:szCs w:val="20"/>
+          <w:lang w:val="en-US" w:eastAsia="en-US"/>
+        </w:rPr>
+        <w:t>(</w:t>
+      </w:r>
+      <w:proofErr w:type="gramEnd"/>
+      <w:r>
+        <w:rPr>
+          <w:rFonts w:ascii="var(--font-mono)" w:hAnsi="var(--font-mono)" w:cs="Courier New"/>
+          <w:color w:val="D3D7DE"/>
+          <w:sz w:val="20"/>
+          <w:szCs w:val="20"/>
+          <w:lang w:val="en-US" w:eastAsia="en-US"/>
+        </w:rPr>
+        <w:t>(</w:t>
+      </w:r>
+      <w:r>
+        <w:rPr>
+          <w:rFonts w:ascii="var(--font-mono)" w:hAnsi="var(--font-mono)" w:cs="Courier New"/>
+          <w:color w:val="F7AB5F"/>
+          <w:sz w:val="20"/>
+          <w:szCs w:val="20"/>
+          <w:lang w:val="en-US" w:eastAsia="en-US"/>
+        </w:rPr>
+        <w:t>req</w:t>
+      </w:r>
+      <w:r>
+        <w:rPr>
+          <w:rFonts w:ascii="var(--font-mono)" w:hAnsi="var(--font-mono)" w:cs="Courier New"/>
+          <w:color w:val="D3D7DE"/>
+          <w:sz w:val="20"/>
+          <w:szCs w:val="20"/>
+          <w:lang w:val="en-US" w:eastAsia="en-US"/>
+        </w:rPr>
+        <w:t>,</w:t>
+      </w:r>
+      <w:r>
+        <w:rPr>
+          <w:rFonts w:ascii="var(--font-mono)" w:hAnsi="var(--font-mono)" w:cs="Courier New"/>
+          <w:color w:val="F7AB5F"/>
+          <w:sz w:val="20"/>
+          <w:szCs w:val="20"/>
+          <w:lang w:val="en-US" w:eastAsia="en-US"/>
+        </w:rPr>
+        <w:t xml:space="preserve"> res</w:t>
+      </w:r>
+      <w:r>
+        <w:rPr>
+          <w:rFonts w:ascii="var(--font-mono)" w:hAnsi="var(--font-mono)" w:cs="Courier New"/>
+          <w:color w:val="D3D7DE"/>
+          <w:sz w:val="20"/>
+          <w:szCs w:val="20"/>
+          <w:lang w:val="en-US" w:eastAsia="en-US"/>
+        </w:rPr>
+        <w:t>)</w:t>
+      </w:r>
+      <w:r>
+        <w:rPr>
+          <w:rFonts w:ascii="var(--font-mono)" w:hAnsi="var(--font-mono)" w:cs="Courier New"/>
+          <w:color w:val="EAECF0"/>
+          <w:sz w:val="20"/>
+          <w:szCs w:val="20"/>
+          <w:lang w:val="en-US" w:eastAsia="en-US"/>
+        </w:rPr>
+        <w:t xml:space="preserve"> =&gt; </w:t>
+      </w:r>
+      <w:proofErr w:type="spellStart"/>
+      <w:r>
+        <w:rPr>
+          <w:rFonts w:ascii="var(--font-mono)" w:hAnsi="var(--font-mono)" w:cs="Courier New"/>
+          <w:color w:val="EAECF0"/>
+          <w:sz w:val="20"/>
+          <w:szCs w:val="20"/>
+          <w:lang w:val="en-US" w:eastAsia="en-US"/>
+        </w:rPr>
+        <w:t>res</w:t>
+      </w:r>
+      <w:r>
+        <w:rPr>
+          <w:rFonts w:ascii="var(--font-mono)" w:hAnsi="var(--font-mono)" w:cs="Courier New"/>
+          <w:color w:val="D3D7DE"/>
+          <w:sz w:val="20"/>
+          <w:szCs w:val="20"/>
+          <w:lang w:val="en-US" w:eastAsia="en-US"/>
+        </w:rPr>
+        <w:t>.</w:t>
+      </w:r>
+      <w:r>
+        <w:rPr>
+          <w:rFonts w:ascii="var(--font-mono)" w:hAnsi="var(--font-mono)" w:cs="Courier New"/>
+          <w:color w:val="70B8FF"/>
+          <w:sz w:val="20"/>
+          <w:szCs w:val="20"/>
+          <w:lang w:val="en-US" w:eastAsia="en-US"/>
+        </w:rPr>
+        <w:t>status</w:t>
+      </w:r>
+      <w:proofErr w:type="spellEnd"/>
+      <w:r>
+        <w:rPr>
+          <w:rFonts w:ascii="var(--font-mono)" w:hAnsi="var(--font-mono)" w:cs="Courier New"/>
+          <w:color w:val="D3D7DE"/>
+          <w:sz w:val="20"/>
+          <w:szCs w:val="20"/>
+          <w:lang w:val="en-US" w:eastAsia="en-US"/>
+        </w:rPr>
+        <w:t>(</w:t>
+      </w:r>
+      <w:r>
+        <w:rPr>
+          <w:rFonts w:ascii="var(--font-mono)" w:hAnsi="var(--font-mono)" w:cs="Courier New"/>
+          <w:color w:val="5EEDED"/>
+          <w:sz w:val="20"/>
+          <w:szCs w:val="20"/>
+          <w:lang w:val="en-US" w:eastAsia="en-US"/>
+        </w:rPr>
+        <w:t>404</w:t>
+      </w:r>
+      <w:r>
+        <w:rPr>
+          <w:rFonts w:ascii="var(--font-mono)" w:hAnsi="var(--font-mono)" w:cs="Courier New"/>
+          <w:color w:val="D3D7DE"/>
+          <w:sz w:val="20"/>
+          <w:szCs w:val="20"/>
+          <w:lang w:val="en-US" w:eastAsia="en-US"/>
+        </w:rPr>
+        <w:t>).</w:t>
+      </w:r>
+      <w:r>
+        <w:rPr>
+          <w:rFonts w:ascii="var(--font-mono)" w:hAnsi="var(--font-mono)" w:cs="Courier New"/>
+          <w:color w:val="70B8FF"/>
+          <w:sz w:val="20"/>
+          <w:szCs w:val="20"/>
+          <w:lang w:val="en-US" w:eastAsia="en-US"/>
+        </w:rPr>
+        <w:t>send</w:t>
+      </w:r>
+      <w:r>
+        <w:rPr>
+          <w:rFonts w:ascii="var(--font-mono)" w:hAnsi="var(--font-mono)" w:cs="Courier New"/>
+          <w:color w:val="D3D7DE"/>
+          <w:sz w:val="20"/>
+          <w:szCs w:val="20"/>
+          <w:lang w:val="en-US" w:eastAsia="en-US"/>
+        </w:rPr>
+        <w:t>(</w:t>
+      </w:r>
+      <w:r>
+        <w:rPr>
+          <w:rFonts w:ascii="var(--font-mono)" w:hAnsi="var(--font-mono)" w:cs="Courier New"/>
+          <w:color w:val="9BE963"/>
+          <w:sz w:val="20"/>
+          <w:szCs w:val="20"/>
+          <w:lang w:val="en-US" w:eastAsia="en-US"/>
+        </w:rPr>
+        <w:t>'Not Found'</w:t>
+      </w:r>
+      <w:r>
+        <w:rPr>
+          <w:rFonts w:ascii="var(--font-mono)" w:hAnsi="var(--font-mono)" w:cs="Courier New"/>
+          <w:color w:val="D3D7DE"/>
+          <w:sz w:val="20"/>
+          <w:szCs w:val="20"/>
+          <w:lang w:val="en-US" w:eastAsia="en-US"/>
+        </w:rPr>
+        <w:t>));</w:t>
+      </w:r>
+    </w:p>
+    <w:p>
+      <w:pPr>
+        <w:numPr>
+          <w:ilvl w:val="1"/>
+          <w:numId w:val="15"/>
+        </w:numPr>
+        <w:spacing w:before="100" w:beforeAutospacing="1" w:after="100" w:afterAutospacing="1"/>
+        <w:rPr>
+          <w:rFonts w:ascii="Times New Roman" w:hAnsi="Times New Roman"/>
+          <w:lang w:val="en-US" w:eastAsia="en-US"/>
+        </w:rPr>
+      </w:pPr>
+      <w:r>
+        <w:rPr>
+          <w:rFonts w:ascii="Times New Roman" w:hAnsi="Times New Roman"/>
+          <w:lang w:val="en-US" w:eastAsia="en-US"/>
+        </w:rPr>
+        <w:t xml:space="preserve">No </w:t>
+      </w:r>
+      <w:proofErr w:type="gramStart"/>
+      <w:r>
+        <w:rPr>
+          <w:rFonts w:ascii="Times New Roman" w:hAnsi="Times New Roman"/>
+          <w:lang w:val="en-US" w:eastAsia="en-US"/>
+        </w:rPr>
+        <w:t>more long</w:t>
+      </w:r>
+      <w:proofErr w:type="gramEnd"/>
+      <w:r>
+        <w:rPr>
+          <w:rFonts w:ascii="Times New Roman" w:hAnsi="Times New Roman"/>
+          <w:lang w:val="en-US" w:eastAsia="en-US"/>
+        </w:rPr>
+        <w:t xml:space="preserve"> </w:t>
+      </w:r>
+      <w:r>
+        <w:rPr>
+          <w:rFonts w:ascii="Courier New" w:hAnsi="Courier New" w:cs="Courier New"/>
+          <w:sz w:val="20"/>
+          <w:szCs w:val="20"/>
+          <w:lang w:val="en-US" w:eastAsia="en-US"/>
+        </w:rPr>
+        <w:t>if/else</w:t>
+      </w:r>
+      <w:r>
+        <w:rPr>
+          <w:rFonts w:ascii="Times New Roman" w:hAnsi="Times New Roman"/>
+          <w:lang w:val="en-US" w:eastAsia="en-US"/>
+        </w:rPr>
+        <w:t xml:space="preserve"> or </w:t>
+      </w:r>
+      <w:r>
+        <w:rPr>
+          <w:rFonts w:ascii="Courier New" w:hAnsi="Courier New" w:cs="Courier New"/>
+          <w:sz w:val="20"/>
+          <w:szCs w:val="20"/>
+          <w:lang w:val="en-US" w:eastAsia="en-US"/>
+        </w:rPr>
+        <w:t>switch</w:t>
+      </w:r>
+      <w:r>
+        <w:rPr>
+          <w:rFonts w:ascii="Times New Roman" w:hAnsi="Times New Roman"/>
+          <w:lang w:val="en-US" w:eastAsia="en-US"/>
+        </w:rPr>
+        <w:t xml:space="preserve"> blocks</w:t>
+      </w:r>
+    </w:p>
+    <w:p>
+      <w:pPr>
+        <w:numPr>
+          <w:ilvl w:val="1"/>
+          <w:numId w:val="15"/>
+        </w:numPr>
+        <w:spacing w:before="100" w:beforeAutospacing="1" w:after="100" w:afterAutospacing="1"/>
+        <w:rPr>
+          <w:rFonts w:ascii="Times New Roman" w:hAnsi="Times New Roman"/>
+          <w:lang w:val="en-US" w:eastAsia="en-US"/>
+        </w:rPr>
+      </w:pPr>
+      <w:r>
+        <w:rPr>
+          <w:rFonts w:ascii="Times New Roman" w:hAnsi="Times New Roman"/>
+          <w:lang w:val="en-US" w:eastAsia="en-US"/>
+        </w:rPr>
+        <w:lastRenderedPageBreak/>
+        <w:t>Method handling (</w:t>
+      </w:r>
+      <w:r>
+        <w:rPr>
+          <w:rFonts w:ascii="Courier New" w:hAnsi="Courier New" w:cs="Courier New"/>
+          <w:sz w:val="20"/>
+          <w:szCs w:val="20"/>
+          <w:lang w:val="en-US" w:eastAsia="en-US"/>
+        </w:rPr>
+        <w:t>GET</w:t>
+      </w:r>
+      <w:r>
+        <w:rPr>
+          <w:rFonts w:ascii="Times New Roman" w:hAnsi="Times New Roman"/>
+          <w:lang w:val="en-US" w:eastAsia="en-US"/>
+        </w:rPr>
+        <w:t xml:space="preserve">, </w:t>
+      </w:r>
+      <w:r>
+        <w:rPr>
+          <w:rFonts w:ascii="Courier New" w:hAnsi="Courier New" w:cs="Courier New"/>
+          <w:sz w:val="20"/>
+          <w:szCs w:val="20"/>
+          <w:lang w:val="en-US" w:eastAsia="en-US"/>
+        </w:rPr>
+        <w:t>POST</w:t>
+      </w:r>
+      <w:r>
+        <w:rPr>
+          <w:rFonts w:ascii="Times New Roman" w:hAnsi="Times New Roman"/>
+          <w:lang w:val="en-US" w:eastAsia="en-US"/>
+        </w:rPr>
+        <w:t>) is built in</w:t>
+      </w:r>
+    </w:p>
+    <w:p>
+      <w:pPr>
+        <w:numPr>
+          <w:ilvl w:val="1"/>
+          <w:numId w:val="15"/>
+        </w:numPr>
+        <w:spacing w:before="100" w:beforeAutospacing="1" w:after="100" w:afterAutospacing="1"/>
+        <w:rPr>
+          <w:rFonts w:ascii="Times New Roman" w:hAnsi="Times New Roman"/>
+          <w:lang w:val="en-US" w:eastAsia="en-US"/>
+        </w:rPr>
+      </w:pPr>
+      <w:r>
+        <w:rPr>
+          <w:rFonts w:ascii="Times New Roman" w:hAnsi="Times New Roman"/>
+          <w:lang w:val="en-US" w:eastAsia="en-US"/>
+        </w:rPr>
+        <w:t>Routes can be split into separate files</w:t>
+      </w:r>
+    </w:p>
+    <w:p>
+      <w:pPr>
+        <w:numPr>
+          <w:ilvl w:val="1"/>
+          <w:numId w:val="15"/>
+        </w:numPr>
+        <w:spacing w:before="100" w:beforeAutospacing="1" w:after="100" w:afterAutospacing="1"/>
+        <w:rPr>
+          <w:rFonts w:ascii="Times New Roman" w:hAnsi="Times New Roman"/>
+          <w:lang w:val="en-US" w:eastAsia="en-US"/>
+        </w:rPr>
+      </w:pPr>
+      <w:r>
+        <w:rPr>
+          <w:rFonts w:ascii="Times New Roman" w:hAnsi="Times New Roman"/>
+          <w:lang w:val="en-US" w:eastAsia="en-US"/>
+        </w:rPr>
+        <w:t>Error and 404 handling is built in</w:t>
       </w:r>
     </w:p>
     <w:p/>
@@ -3210,14 +5177,14 @@
         <v:path o:extrusionok="f" gradientshapeok="t" o:connecttype="rect"/>
         <o:lock v:ext="edit" aspectratio="t"/>
       </v:shapetype>
-      <v:shape id="_x0000_i1034" type="#_x0000_t75" style="width:15pt;height:15pt;visibility:visible;mso-wrap-style:square" o:bullet="t">
+      <v:shape id="_x0000_i1124" type="#_x0000_t75" style="width:15.2pt;height:15.2pt;visibility:visible;mso-wrap-style:square" o:bullet="t">
         <v:imagedata r:id="rId1" o:title=""/>
       </v:shape>
     </w:pict>
   </w:numPicBullet>
   <w:numPicBullet w:numPicBulletId="1">
     <w:pict>
-      <v:shape id="_x0000_i1035" type="#_x0000_t75" style="width:12.6pt;height:12.6pt;visibility:visible;mso-wrap-style:square" o:bullet="t">
+      <v:shape id="_x0000_i1125" type="#_x0000_t75" style="width:12.7pt;height:12.7pt;visibility:visible;mso-wrap-style:square" o:bullet="t">
         <v:imagedata r:id="rId2" o:title=""/>
       </v:shape>
     </w:pict>
@@ -3563,6 +5530,155 @@
     </w:lvl>
   </w:abstractNum>
   <w:abstractNum w:abstractNumId="3" w15:restartNumberingAfterBreak="0">
+    <w:nsid w:val="0FCA5946"/>
+    <w:multiLevelType w:val="multilevel"/>
+    <w:tmpl w:val="1E445EE4"/>
+    <w:lvl w:ilvl="0">
+      <w:start w:val="1"/>
+      <w:numFmt w:val="bullet"/>
+      <w:lvlText w:val=""/>
+      <w:lvlJc w:val="left"/>
+      <w:pPr>
+        <w:tabs>
+          <w:tab w:val="num" w:pos="720"/>
+        </w:tabs>
+        <w:ind w:left="720" w:hanging="360"/>
+      </w:pPr>
+      <w:rPr>
+        <w:rFonts w:ascii="Symbol" w:hAnsi="Symbol" w:hint="default"/>
+        <w:sz w:val="20"/>
+      </w:rPr>
+    </w:lvl>
+    <w:lvl w:ilvl="1" w:tentative="1">
+      <w:start w:val="1"/>
+      <w:numFmt w:val="bullet"/>
+      <w:lvlText w:val="o"/>
+      <w:lvlJc w:val="left"/>
+      <w:pPr>
+        <w:tabs>
+          <w:tab w:val="num" w:pos="1440"/>
+        </w:tabs>
+        <w:ind w:left="1440" w:hanging="360"/>
+      </w:pPr>
+      <w:rPr>
+        <w:rFonts w:ascii="Courier New" w:hAnsi="Courier New" w:hint="default"/>
+        <w:sz w:val="20"/>
+      </w:rPr>
+    </w:lvl>
+    <w:lvl w:ilvl="2" w:tentative="1">
+      <w:start w:val="1"/>
+      <w:numFmt w:val="bullet"/>
+      <w:lvlText w:val=""/>
+      <w:lvlJc w:val="left"/>
+      <w:pPr>
+        <w:tabs>
+          <w:tab w:val="num" w:pos="2160"/>
+        </w:tabs>
+        <w:ind w:left="2160" w:hanging="360"/>
+      </w:pPr>
+      <w:rPr>
+        <w:rFonts w:ascii="Wingdings" w:hAnsi="Wingdings" w:hint="default"/>
+        <w:sz w:val="20"/>
+      </w:rPr>
+    </w:lvl>
+    <w:lvl w:ilvl="3" w:tentative="1">
+      <w:start w:val="1"/>
+      <w:numFmt w:val="bullet"/>
+      <w:lvlText w:val=""/>
+      <w:lvlJc w:val="left"/>
+      <w:pPr>
+        <w:tabs>
+          <w:tab w:val="num" w:pos="2880"/>
+        </w:tabs>
+        <w:ind w:left="2880" w:hanging="360"/>
+      </w:pPr>
+      <w:rPr>
+        <w:rFonts w:ascii="Wingdings" w:hAnsi="Wingdings" w:hint="default"/>
+        <w:sz w:val="20"/>
+      </w:rPr>
+    </w:lvl>
+    <w:lvl w:ilvl="4" w:tentative="1">
+      <w:start w:val="1"/>
+      <w:numFmt w:val="bullet"/>
+      <w:lvlText w:val=""/>
+      <w:lvlJc w:val="left"/>
+      <w:pPr>
+        <w:tabs>
+          <w:tab w:val="num" w:pos="3600"/>
+        </w:tabs>
+        <w:ind w:left="3600" w:hanging="360"/>
+      </w:pPr>
+      <w:rPr>
+        <w:rFonts w:ascii="Wingdings" w:hAnsi="Wingdings" w:hint="default"/>
+        <w:sz w:val="20"/>
+      </w:rPr>
+    </w:lvl>
+    <w:lvl w:ilvl="5" w:tentative="1">
+      <w:start w:val="1"/>
+      <w:numFmt w:val="bullet"/>
+      <w:lvlText w:val=""/>
+      <w:lvlJc w:val="left"/>
+      <w:pPr>
+        <w:tabs>
+          <w:tab w:val="num" w:pos="4320"/>
+        </w:tabs>
+        <w:ind w:left="4320" w:hanging="360"/>
+      </w:pPr>
+      <w:rPr>
+        <w:rFonts w:ascii="Wingdings" w:hAnsi="Wingdings" w:hint="default"/>
+        <w:sz w:val="20"/>
+      </w:rPr>
+    </w:lvl>
+    <w:lvl w:ilvl="6" w:tentative="1">
+      <w:start w:val="1"/>
+      <w:numFmt w:val="bullet"/>
+      <w:lvlText w:val=""/>
+      <w:lvlJc w:val="left"/>
+      <w:pPr>
+        <w:tabs>
+          <w:tab w:val="num" w:pos="5040"/>
+        </w:tabs>
+        <w:ind w:left="5040" w:hanging="360"/>
+      </w:pPr>
+      <w:rPr>
+        <w:rFonts w:ascii="Wingdings" w:hAnsi="Wingdings" w:hint="default"/>
+        <w:sz w:val="20"/>
+      </w:rPr>
+    </w:lvl>
+    <w:lvl w:ilvl="7" w:tentative="1">
+      <w:start w:val="1"/>
+      <w:numFmt w:val="bullet"/>
+      <w:lvlText w:val=""/>
+      <w:lvlJc w:val="left"/>
+      <w:pPr>
+        <w:tabs>
+          <w:tab w:val="num" w:pos="5760"/>
+        </w:tabs>
+        <w:ind w:left="5760" w:hanging="360"/>
+      </w:pPr>
+      <w:rPr>
+        <w:rFonts w:ascii="Wingdings" w:hAnsi="Wingdings" w:hint="default"/>
+        <w:sz w:val="20"/>
+      </w:rPr>
+    </w:lvl>
+    <w:lvl w:ilvl="8" w:tentative="1">
+      <w:start w:val="1"/>
+      <w:numFmt w:val="bullet"/>
+      <w:lvlText w:val=""/>
+      <w:lvlJc w:val="left"/>
+      <w:pPr>
+        <w:tabs>
+          <w:tab w:val="num" w:pos="6480"/>
+        </w:tabs>
+        <w:ind w:left="6480" w:hanging="360"/>
+      </w:pPr>
+      <w:rPr>
+        <w:rFonts w:ascii="Wingdings" w:hAnsi="Wingdings" w:hint="default"/>
+        <w:sz w:val="20"/>
+      </w:rPr>
+    </w:lvl>
+  </w:abstractNum>
+  <w:abstractNum w:abstractNumId="4" w15:restartNumberingAfterBreak="0">
     <w:nsid w:val="118D7DAC"/>
     <w:multiLevelType w:val="hybridMultilevel"/>
     <w:tmpl w:val="28048FDC"/>
@@ -3648,7 +5764,7 @@
       </w:pPr>
     </w:lvl>
   </w:abstractNum>
-  <w:abstractNum w:abstractNumId="4" w15:restartNumberingAfterBreak="0">
+  <w:abstractNum w:abstractNumId="5" w15:restartNumberingAfterBreak="0">
     <w:nsid w:val="151F71C4"/>
     <w:multiLevelType w:val="hybridMultilevel"/>
     <w:tmpl w:val="9D4E5D04"/>
@@ -3761,7 +5877,7 @@
       </w:rPr>
     </w:lvl>
   </w:abstractNum>
-  <w:abstractNum w:abstractNumId="5" w15:restartNumberingAfterBreak="0">
+  <w:abstractNum w:abstractNumId="6" w15:restartNumberingAfterBreak="0">
     <w:nsid w:val="1FD61612"/>
     <w:multiLevelType w:val="multilevel"/>
     <w:tmpl w:val="D34EFF22"/>
@@ -3874,7 +5990,7 @@
       </w:pPr>
     </w:lvl>
   </w:abstractNum>
-  <w:abstractNum w:abstractNumId="6" w15:restartNumberingAfterBreak="0">
+  <w:abstractNum w:abstractNumId="7" w15:restartNumberingAfterBreak="0">
     <w:nsid w:val="24F16B85"/>
     <w:multiLevelType w:val="hybridMultilevel"/>
     <w:tmpl w:val="5C92BF88"/>
@@ -3987,7 +6103,305 @@
       </w:rPr>
     </w:lvl>
   </w:abstractNum>
-  <w:abstractNum w:abstractNumId="7" w15:restartNumberingAfterBreak="0">
+  <w:abstractNum w:abstractNumId="8" w15:restartNumberingAfterBreak="0">
+    <w:nsid w:val="315B3E89"/>
+    <w:multiLevelType w:val="multilevel"/>
+    <w:tmpl w:val="91EED58A"/>
+    <w:lvl w:ilvl="0">
+      <w:start w:val="1"/>
+      <w:numFmt w:val="bullet"/>
+      <w:lvlText w:val=""/>
+      <w:lvlJc w:val="left"/>
+      <w:pPr>
+        <w:tabs>
+          <w:tab w:val="num" w:pos="720"/>
+        </w:tabs>
+        <w:ind w:left="720" w:hanging="360"/>
+      </w:pPr>
+      <w:rPr>
+        <w:rFonts w:ascii="Symbol" w:hAnsi="Symbol" w:hint="default"/>
+        <w:sz w:val="20"/>
+      </w:rPr>
+    </w:lvl>
+    <w:lvl w:ilvl="1" w:tentative="1">
+      <w:start w:val="1"/>
+      <w:numFmt w:val="bullet"/>
+      <w:lvlText w:val="o"/>
+      <w:lvlJc w:val="left"/>
+      <w:pPr>
+        <w:tabs>
+          <w:tab w:val="num" w:pos="1440"/>
+        </w:tabs>
+        <w:ind w:left="1440" w:hanging="360"/>
+      </w:pPr>
+      <w:rPr>
+        <w:rFonts w:ascii="Courier New" w:hAnsi="Courier New" w:hint="default"/>
+        <w:sz w:val="20"/>
+      </w:rPr>
+    </w:lvl>
+    <w:lvl w:ilvl="2" w:tentative="1">
+      <w:start w:val="1"/>
+      <w:numFmt w:val="bullet"/>
+      <w:lvlText w:val=""/>
+      <w:lvlJc w:val="left"/>
+      <w:pPr>
+        <w:tabs>
+          <w:tab w:val="num" w:pos="2160"/>
+        </w:tabs>
+        <w:ind w:left="2160" w:hanging="360"/>
+      </w:pPr>
+      <w:rPr>
+        <w:rFonts w:ascii="Wingdings" w:hAnsi="Wingdings" w:hint="default"/>
+        <w:sz w:val="20"/>
+      </w:rPr>
+    </w:lvl>
+    <w:lvl w:ilvl="3" w:tentative="1">
+      <w:start w:val="1"/>
+      <w:numFmt w:val="bullet"/>
+      <w:lvlText w:val=""/>
+      <w:lvlJc w:val="left"/>
+      <w:pPr>
+        <w:tabs>
+          <w:tab w:val="num" w:pos="2880"/>
+        </w:tabs>
+        <w:ind w:left="2880" w:hanging="360"/>
+      </w:pPr>
+      <w:rPr>
+        <w:rFonts w:ascii="Wingdings" w:hAnsi="Wingdings" w:hint="default"/>
+        <w:sz w:val="20"/>
+      </w:rPr>
+    </w:lvl>
+    <w:lvl w:ilvl="4" w:tentative="1">
+      <w:start w:val="1"/>
+      <w:numFmt w:val="bullet"/>
+      <w:lvlText w:val=""/>
+      <w:lvlJc w:val="left"/>
+      <w:pPr>
+        <w:tabs>
+          <w:tab w:val="num" w:pos="3600"/>
+        </w:tabs>
+        <w:ind w:left="3600" w:hanging="360"/>
+      </w:pPr>
+      <w:rPr>
+        <w:rFonts w:ascii="Wingdings" w:hAnsi="Wingdings" w:hint="default"/>
+        <w:sz w:val="20"/>
+      </w:rPr>
+    </w:lvl>
+    <w:lvl w:ilvl="5" w:tentative="1">
+      <w:start w:val="1"/>
+      <w:numFmt w:val="bullet"/>
+      <w:lvlText w:val=""/>
+      <w:lvlJc w:val="left"/>
+      <w:pPr>
+        <w:tabs>
+          <w:tab w:val="num" w:pos="4320"/>
+        </w:tabs>
+        <w:ind w:left="4320" w:hanging="360"/>
+      </w:pPr>
+      <w:rPr>
+        <w:rFonts w:ascii="Wingdings" w:hAnsi="Wingdings" w:hint="default"/>
+        <w:sz w:val="20"/>
+      </w:rPr>
+    </w:lvl>
+    <w:lvl w:ilvl="6" w:tentative="1">
+      <w:start w:val="1"/>
+      <w:numFmt w:val="bullet"/>
+      <w:lvlText w:val=""/>
+      <w:lvlJc w:val="left"/>
+      <w:pPr>
+        <w:tabs>
+          <w:tab w:val="num" w:pos="5040"/>
+        </w:tabs>
+        <w:ind w:left="5040" w:hanging="360"/>
+      </w:pPr>
+      <w:rPr>
+        <w:rFonts w:ascii="Wingdings" w:hAnsi="Wingdings" w:hint="default"/>
+        <w:sz w:val="20"/>
+      </w:rPr>
+    </w:lvl>
+    <w:lvl w:ilvl="7" w:tentative="1">
+      <w:start w:val="1"/>
+      <w:numFmt w:val="bullet"/>
+      <w:lvlText w:val=""/>
+      <w:lvlJc w:val="left"/>
+      <w:pPr>
+        <w:tabs>
+          <w:tab w:val="num" w:pos="5760"/>
+        </w:tabs>
+        <w:ind w:left="5760" w:hanging="360"/>
+      </w:pPr>
+      <w:rPr>
+        <w:rFonts w:ascii="Wingdings" w:hAnsi="Wingdings" w:hint="default"/>
+        <w:sz w:val="20"/>
+      </w:rPr>
+    </w:lvl>
+    <w:lvl w:ilvl="8" w:tentative="1">
+      <w:start w:val="1"/>
+      <w:numFmt w:val="bullet"/>
+      <w:lvlText w:val=""/>
+      <w:lvlJc w:val="left"/>
+      <w:pPr>
+        <w:tabs>
+          <w:tab w:val="num" w:pos="6480"/>
+        </w:tabs>
+        <w:ind w:left="6480" w:hanging="360"/>
+      </w:pPr>
+      <w:rPr>
+        <w:rFonts w:ascii="Wingdings" w:hAnsi="Wingdings" w:hint="default"/>
+        <w:sz w:val="20"/>
+      </w:rPr>
+    </w:lvl>
+  </w:abstractNum>
+  <w:abstractNum w:abstractNumId="9" w15:restartNumberingAfterBreak="0">
+    <w:nsid w:val="316F3CEA"/>
+    <w:multiLevelType w:val="multilevel"/>
+    <w:tmpl w:val="30709DDA"/>
+    <w:lvl w:ilvl="0">
+      <w:start w:val="1"/>
+      <w:numFmt w:val="bullet"/>
+      <w:lvlText w:val=""/>
+      <w:lvlJc w:val="left"/>
+      <w:pPr>
+        <w:tabs>
+          <w:tab w:val="num" w:pos="720"/>
+        </w:tabs>
+        <w:ind w:left="720" w:hanging="360"/>
+      </w:pPr>
+      <w:rPr>
+        <w:rFonts w:ascii="Symbol" w:hAnsi="Symbol" w:hint="default"/>
+        <w:sz w:val="20"/>
+      </w:rPr>
+    </w:lvl>
+    <w:lvl w:ilvl="1" w:tentative="1">
+      <w:start w:val="1"/>
+      <w:numFmt w:val="bullet"/>
+      <w:lvlText w:val="o"/>
+      <w:lvlJc w:val="left"/>
+      <w:pPr>
+        <w:tabs>
+          <w:tab w:val="num" w:pos="1440"/>
+        </w:tabs>
+        <w:ind w:left="1440" w:hanging="360"/>
+      </w:pPr>
+      <w:rPr>
+        <w:rFonts w:ascii="Courier New" w:hAnsi="Courier New" w:hint="default"/>
+        <w:sz w:val="20"/>
+      </w:rPr>
+    </w:lvl>
+    <w:lvl w:ilvl="2" w:tentative="1">
+      <w:start w:val="1"/>
+      <w:numFmt w:val="bullet"/>
+      <w:lvlText w:val=""/>
+      <w:lvlJc w:val="left"/>
+      <w:pPr>
+        <w:tabs>
+          <w:tab w:val="num" w:pos="2160"/>
+        </w:tabs>
+        <w:ind w:left="2160" w:hanging="360"/>
+      </w:pPr>
+      <w:rPr>
+        <w:rFonts w:ascii="Wingdings" w:hAnsi="Wingdings" w:hint="default"/>
+        <w:sz w:val="20"/>
+      </w:rPr>
+    </w:lvl>
+    <w:lvl w:ilvl="3" w:tentative="1">
+      <w:start w:val="1"/>
+      <w:numFmt w:val="bullet"/>
+      <w:lvlText w:val=""/>
+      <w:lvlJc w:val="left"/>
+      <w:pPr>
+        <w:tabs>
+          <w:tab w:val="num" w:pos="2880"/>
+        </w:tabs>
+        <w:ind w:left="2880" w:hanging="360"/>
+      </w:pPr>
+      <w:rPr>
+        <w:rFonts w:ascii="Wingdings" w:hAnsi="Wingdings" w:hint="default"/>
+        <w:sz w:val="20"/>
+      </w:rPr>
+    </w:lvl>
+    <w:lvl w:ilvl="4" w:tentative="1">
+      <w:start w:val="1"/>
+      <w:numFmt w:val="bullet"/>
+      <w:lvlText w:val=""/>
+      <w:lvlJc w:val="left"/>
+      <w:pPr>
+        <w:tabs>
+          <w:tab w:val="num" w:pos="3600"/>
+        </w:tabs>
+        <w:ind w:left="3600" w:hanging="360"/>
+      </w:pPr>
+      <w:rPr>
+        <w:rFonts w:ascii="Wingdings" w:hAnsi="Wingdings" w:hint="default"/>
+        <w:sz w:val="20"/>
+      </w:rPr>
+    </w:lvl>
+    <w:lvl w:ilvl="5" w:tentative="1">
+      <w:start w:val="1"/>
+      <w:numFmt w:val="bullet"/>
+      <w:lvlText w:val=""/>
+      <w:lvlJc w:val="left"/>
+      <w:pPr>
+        <w:tabs>
+          <w:tab w:val="num" w:pos="4320"/>
+        </w:tabs>
+        <w:ind w:left="4320" w:hanging="360"/>
+      </w:pPr>
+      <w:rPr>
+        <w:rFonts w:ascii="Wingdings" w:hAnsi="Wingdings" w:hint="default"/>
+        <w:sz w:val="20"/>
+      </w:rPr>
+    </w:lvl>
+    <w:lvl w:ilvl="6" w:tentative="1">
+      <w:start w:val="1"/>
+      <w:numFmt w:val="bullet"/>
+      <w:lvlText w:val=""/>
+      <w:lvlJc w:val="left"/>
+      <w:pPr>
+        <w:tabs>
+          <w:tab w:val="num" w:pos="5040"/>
+        </w:tabs>
+        <w:ind w:left="5040" w:hanging="360"/>
+      </w:pPr>
+      <w:rPr>
+        <w:rFonts w:ascii="Wingdings" w:hAnsi="Wingdings" w:hint="default"/>
+        <w:sz w:val="20"/>
+      </w:rPr>
+    </w:lvl>
+    <w:lvl w:ilvl="7" w:tentative="1">
+      <w:start w:val="1"/>
+      <w:numFmt w:val="bullet"/>
+      <w:lvlText w:val=""/>
+      <w:lvlJc w:val="left"/>
+      <w:pPr>
+        <w:tabs>
+          <w:tab w:val="num" w:pos="5760"/>
+        </w:tabs>
+        <w:ind w:left="5760" w:hanging="360"/>
+      </w:pPr>
+      <w:rPr>
+        <w:rFonts w:ascii="Wingdings" w:hAnsi="Wingdings" w:hint="default"/>
+        <w:sz w:val="20"/>
+      </w:rPr>
+    </w:lvl>
+    <w:lvl w:ilvl="8" w:tentative="1">
+      <w:start w:val="1"/>
+      <w:numFmt w:val="bullet"/>
+      <w:lvlText w:val=""/>
+      <w:lvlJc w:val="left"/>
+      <w:pPr>
+        <w:tabs>
+          <w:tab w:val="num" w:pos="6480"/>
+        </w:tabs>
+        <w:ind w:left="6480" w:hanging="360"/>
+      </w:pPr>
+      <w:rPr>
+        <w:rFonts w:ascii="Wingdings" w:hAnsi="Wingdings" w:hint="default"/>
+        <w:sz w:val="20"/>
+      </w:rPr>
+    </w:lvl>
+  </w:abstractNum>
+  <w:abstractNum w:abstractNumId="10" w15:restartNumberingAfterBreak="0">
     <w:nsid w:val="34DA50C1"/>
     <w:multiLevelType w:val="multilevel"/>
     <w:tmpl w:val="654808B2"/>
@@ -4100,7 +6514,7 @@
       </w:rPr>
     </w:lvl>
   </w:abstractNum>
-  <w:abstractNum w:abstractNumId="8" w15:restartNumberingAfterBreak="0">
+  <w:abstractNum w:abstractNumId="11" w15:restartNumberingAfterBreak="0">
     <w:nsid w:val="397A4D38"/>
     <w:multiLevelType w:val="multilevel"/>
     <w:tmpl w:val="4BE85BB6"/>
@@ -4213,7 +6627,7 @@
       </w:pPr>
     </w:lvl>
   </w:abstractNum>
-  <w:abstractNum w:abstractNumId="9" w15:restartNumberingAfterBreak="0">
+  <w:abstractNum w:abstractNumId="12" w15:restartNumberingAfterBreak="0">
     <w:nsid w:val="470E392B"/>
     <w:multiLevelType w:val="multilevel"/>
     <w:tmpl w:val="C9043710"/>
@@ -4325,7 +6739,7 @@
       </w:rPr>
     </w:lvl>
   </w:abstractNum>
-  <w:abstractNum w:abstractNumId="10" w15:restartNumberingAfterBreak="0">
+  <w:abstractNum w:abstractNumId="13" w15:restartNumberingAfterBreak="0">
     <w:nsid w:val="4E0715FF"/>
     <w:multiLevelType w:val="hybridMultilevel"/>
     <w:tmpl w:val="CC14AB74"/>
@@ -4438,7 +6852,7 @@
       </w:rPr>
     </w:lvl>
   </w:abstractNum>
-  <w:abstractNum w:abstractNumId="11" w15:restartNumberingAfterBreak="0">
+  <w:abstractNum w:abstractNumId="14" w15:restartNumberingAfterBreak="0">
     <w:nsid w:val="4F7B67FB"/>
     <w:multiLevelType w:val="multilevel"/>
     <w:tmpl w:val="2BA8260A"/>
@@ -4584,7 +6998,7 @@
       </w:rPr>
     </w:lvl>
   </w:abstractNum>
-  <w:abstractNum w:abstractNumId="12" w15:restartNumberingAfterBreak="0">
+  <w:abstractNum w:abstractNumId="15" w15:restartNumberingAfterBreak="0">
     <w:nsid w:val="583C3A9C"/>
     <w:multiLevelType w:val="hybridMultilevel"/>
     <w:tmpl w:val="793670A6"/>
@@ -4696,7 +7110,7 @@
       </w:rPr>
     </w:lvl>
   </w:abstractNum>
-  <w:abstractNum w:abstractNumId="13" w15:restartNumberingAfterBreak="0">
+  <w:abstractNum w:abstractNumId="16" w15:restartNumberingAfterBreak="0">
     <w:nsid w:val="5C9056CF"/>
     <w:multiLevelType w:val="multilevel"/>
     <w:tmpl w:val="0636B5DC"/>
@@ -4845,7 +7259,7 @@
       </w:rPr>
     </w:lvl>
   </w:abstractNum>
-  <w:abstractNum w:abstractNumId="14" w15:restartNumberingAfterBreak="0">
+  <w:abstractNum w:abstractNumId="17" w15:restartNumberingAfterBreak="0">
     <w:nsid w:val="67185ECE"/>
     <w:multiLevelType w:val="multilevel"/>
     <w:tmpl w:val="7E4A66A0"/>
@@ -4959,7 +7373,7 @@
       </w:rPr>
     </w:lvl>
   </w:abstractNum>
-  <w:abstractNum w:abstractNumId="15" w15:restartNumberingAfterBreak="0">
+  <w:abstractNum w:abstractNumId="18" w15:restartNumberingAfterBreak="0">
     <w:nsid w:val="68652D94"/>
     <w:multiLevelType w:val="hybridMultilevel"/>
     <w:tmpl w:val="7FDCB558"/>
@@ -5072,7 +7486,7 @@
       </w:rPr>
     </w:lvl>
   </w:abstractNum>
-  <w:abstractNum w:abstractNumId="16" w15:restartNumberingAfterBreak="0">
+  <w:abstractNum w:abstractNumId="19" w15:restartNumberingAfterBreak="0">
     <w:nsid w:val="6D605953"/>
     <w:multiLevelType w:val="hybridMultilevel"/>
     <w:tmpl w:val="FF8C222A"/>
@@ -5213,7 +7627,7 @@
       </w:rPr>
     </w:lvl>
   </w:abstractNum>
-  <w:abstractNum w:abstractNumId="17" w15:restartNumberingAfterBreak="0">
+  <w:abstractNum w:abstractNumId="20" w15:restartNumberingAfterBreak="0">
     <w:nsid w:val="6DC141B2"/>
     <w:multiLevelType w:val="multilevel"/>
     <w:tmpl w:val="38FA2460"/>
@@ -5362,7 +7776,7 @@
       </w:rPr>
     </w:lvl>
   </w:abstractNum>
-  <w:abstractNum w:abstractNumId="18" w15:restartNumberingAfterBreak="0">
+  <w:abstractNum w:abstractNumId="21" w15:restartNumberingAfterBreak="0">
     <w:nsid w:val="70FC43DF"/>
     <w:multiLevelType w:val="hybridMultilevel"/>
     <w:tmpl w:val="03BCC2EA"/>
@@ -5475,7 +7889,7 @@
       </w:rPr>
     </w:lvl>
   </w:abstractNum>
-  <w:abstractNum w:abstractNumId="19" w15:restartNumberingAfterBreak="0">
+  <w:abstractNum w:abstractNumId="22" w15:restartNumberingAfterBreak="0">
     <w:nsid w:val="719644CB"/>
     <w:multiLevelType w:val="hybridMultilevel"/>
     <w:tmpl w:val="E800CBC6"/>
@@ -5616,10 +8030,10 @@
       </w:rPr>
     </w:lvl>
   </w:abstractNum>
-  <w:abstractNum w:abstractNumId="20" w15:restartNumberingAfterBreak="0">
+  <w:abstractNum w:abstractNumId="23" w15:restartNumberingAfterBreak="0">
     <w:nsid w:val="782D2DC7"/>
     <w:multiLevelType w:val="multilevel"/>
-    <w:tmpl w:val="CEDC7092"/>
+    <w:tmpl w:val="D7D0D8E2"/>
     <w:lvl w:ilvl="0">
       <w:start w:val="1"/>
       <w:numFmt w:val="decimal"/>
@@ -5632,17 +8046,16 @@
         <w:ind w:left="720" w:hanging="360"/>
       </w:pPr>
     </w:lvl>
-    <w:lvl w:ilvl="1" w:tentative="1">
-      <w:start w:val="1"/>
-      <w:numFmt w:val="decimal"/>
-      <w:lvlText w:val="%2."/>
-      <w:lvlJc w:val="left"/>
-      <w:pPr>
-        <w:tabs>
-          <w:tab w:val="num" w:pos="1440"/>
-        </w:tabs>
+    <w:lvl w:ilvl="1">
+      <w:numFmt w:val="bullet"/>
+      <w:lvlText w:val=""/>
+      <w:lvlJc w:val="left"/>
+      <w:pPr>
         <w:ind w:left="1440" w:hanging="360"/>
       </w:pPr>
+      <w:rPr>
+        <w:rFonts w:ascii="Wingdings" w:eastAsia="Times New Roman" w:hAnsi="Wingdings" w:cs="Times New Roman" w:hint="default"/>
+      </w:rPr>
     </w:lvl>
     <w:lvl w:ilvl="2" w:tentative="1">
       <w:start w:val="1"/>
@@ -5730,67 +8143,76 @@
     </w:lvl>
   </w:abstractNum>
   <w:num w:numId="1" w16cid:durableId="1721056192">
-    <w:abstractNumId w:val="9"/>
+    <w:abstractNumId w:val="12"/>
   </w:num>
   <w:num w:numId="2" w16cid:durableId="931859328">
-    <w:abstractNumId w:val="14"/>
+    <w:abstractNumId w:val="17"/>
   </w:num>
   <w:num w:numId="3" w16cid:durableId="30225250">
-    <w:abstractNumId w:val="7"/>
+    <w:abstractNumId w:val="10"/>
   </w:num>
   <w:num w:numId="4" w16cid:durableId="1336422048">
     <w:abstractNumId w:val="1"/>
   </w:num>
   <w:num w:numId="5" w16cid:durableId="1117798882">
-    <w:abstractNumId w:val="18"/>
+    <w:abstractNumId w:val="21"/>
   </w:num>
   <w:num w:numId="6" w16cid:durableId="1068263344">
-    <w:abstractNumId w:val="4"/>
+    <w:abstractNumId w:val="5"/>
   </w:num>
   <w:num w:numId="7" w16cid:durableId="1466771675">
-    <w:abstractNumId w:val="12"/>
+    <w:abstractNumId w:val="15"/>
   </w:num>
   <w:num w:numId="8" w16cid:durableId="2074964014">
     <w:abstractNumId w:val="0"/>
   </w:num>
   <w:num w:numId="9" w16cid:durableId="143862138">
-    <w:abstractNumId w:val="15"/>
+    <w:abstractNumId w:val="18"/>
   </w:num>
   <w:num w:numId="10" w16cid:durableId="1263955371">
     <w:abstractNumId w:val="2"/>
   </w:num>
   <w:num w:numId="11" w16cid:durableId="658079076">
+    <w:abstractNumId w:val="7"/>
+  </w:num>
+  <w:num w:numId="12" w16cid:durableId="1716543812">
+    <w:abstractNumId w:val="4"/>
+  </w:num>
+  <w:num w:numId="13" w16cid:durableId="1972317950">
+    <w:abstractNumId w:val="13"/>
+  </w:num>
+  <w:num w:numId="14" w16cid:durableId="1399784206">
+    <w:abstractNumId w:val="14"/>
+  </w:num>
+  <w:num w:numId="15" w16cid:durableId="1986205790">
+    <w:abstractNumId w:val="23"/>
+  </w:num>
+  <w:num w:numId="16" w16cid:durableId="1526405707">
+    <w:abstractNumId w:val="11"/>
+  </w:num>
+  <w:num w:numId="17" w16cid:durableId="606735709">
+    <w:abstractNumId w:val="16"/>
+  </w:num>
+  <w:num w:numId="18" w16cid:durableId="952789783">
     <w:abstractNumId w:val="6"/>
   </w:num>
-  <w:num w:numId="12" w16cid:durableId="1716543812">
+  <w:num w:numId="19" w16cid:durableId="2026399900">
+    <w:abstractNumId w:val="20"/>
+  </w:num>
+  <w:num w:numId="20" w16cid:durableId="145435942">
+    <w:abstractNumId w:val="19"/>
+  </w:num>
+  <w:num w:numId="21" w16cid:durableId="1497765033">
+    <w:abstractNumId w:val="22"/>
+  </w:num>
+  <w:num w:numId="22" w16cid:durableId="1698970762">
     <w:abstractNumId w:val="3"/>
   </w:num>
-  <w:num w:numId="13" w16cid:durableId="1972317950">
-    <w:abstractNumId w:val="10"/>
+  <w:num w:numId="23" w16cid:durableId="419449859">
+    <w:abstractNumId w:val="9"/>
   </w:num>
-  <w:num w:numId="14" w16cid:durableId="1399784206">
-    <w:abstractNumId w:val="11"/>
-  </w:num>
-  <w:num w:numId="15" w16cid:durableId="1986205790">
-    <w:abstractNumId w:val="20"/>
-  </w:num>
-  <w:num w:numId="16" w16cid:durableId="1526405707">
+  <w:num w:numId="24" w16cid:durableId="1162039704">
     <w:abstractNumId w:val="8"/>
-  </w:num>
-  <w:num w:numId="17" w16cid:durableId="606735709">
-    <w:abstractNumId w:val="13"/>
-  </w:num>
-  <w:num w:numId="18" w16cid:durableId="952789783">
-    <w:abstractNumId w:val="5"/>
-  </w:num>
-  <w:num w:numId="19" w16cid:durableId="2026399900">
-    <w:abstractNumId w:val="17"/>
-  </w:num>
-  <w:num w:numId="20" w16cid:durableId="145435942">
-    <w:abstractNumId w:val="16"/>
-  </w:num>
-  <w:num w:numId="21" w16cid:durableId="1497765033">
-    <w:abstractNumId w:val="19"/>
   </w:num>
 </w:numbering>
 </file>
@@ -6322,7 +8744,6 @@
   <w:style w:type="character" w:default="1" w:styleId="DefaultParagraphFont">
     <w:name w:val="Default Paragraph Font"/>
     <w:uiPriority w:val="1"/>
-    <w:semiHidden/>
     <w:unhideWhenUsed/>
   </w:style>
   <w:style w:type="table" w:default="1" w:styleId="TableNormal">
@@ -6601,6 +9022,84 @@
       <w:b/>
       <w:bCs/>
     </w:rPr>
+  </w:style>
+  <w:style w:type="paragraph" w:customStyle="1" w:styleId="font-claude-response-body">
+    <w:name w:val="font-claude-response-body"/>
+    <w:basedOn w:val="Normal"/>
+    <w:rsid w:val="00BB26AA"/>
+    <w:pPr>
+      <w:spacing w:before="100" w:beforeAutospacing="1" w:after="100" w:afterAutospacing="1"/>
+    </w:pPr>
+    <w:rPr>
+      <w:rFonts w:ascii="Times New Roman" w:hAnsi="Times New Roman"/>
+      <w:lang w:val="en-US" w:eastAsia="en-US"/>
+    </w:rPr>
+  </w:style>
+  <w:style w:type="paragraph" w:customStyle="1" w:styleId="whitespace-normal">
+    <w:name w:val="whitespace-normal"/>
+    <w:basedOn w:val="Normal"/>
+    <w:rsid w:val="00BB26AA"/>
+    <w:pPr>
+      <w:spacing w:before="100" w:beforeAutospacing="1" w:after="100" w:afterAutospacing="1"/>
+    </w:pPr>
+    <w:rPr>
+      <w:rFonts w:ascii="Times New Roman" w:hAnsi="Times New Roman"/>
+      <w:lang w:val="en-US" w:eastAsia="en-US"/>
+    </w:rPr>
+  </w:style>
+  <w:style w:type="paragraph" w:styleId="HTMLPreformatted">
+    <w:name w:val="HTML Preformatted"/>
+    <w:basedOn w:val="Normal"/>
+    <w:link w:val="HTMLPreformattedChar"/>
+    <w:uiPriority w:val="99"/>
+    <w:semiHidden/>
+    <w:unhideWhenUsed/>
+    <w:rsid w:val="00DC0B34"/>
+    <w:pPr>
+      <w:tabs>
+        <w:tab w:val="left" w:pos="916"/>
+        <w:tab w:val="left" w:pos="1832"/>
+        <w:tab w:val="left" w:pos="2748"/>
+        <w:tab w:val="left" w:pos="3664"/>
+        <w:tab w:val="left" w:pos="4580"/>
+        <w:tab w:val="left" w:pos="5496"/>
+        <w:tab w:val="left" w:pos="6412"/>
+        <w:tab w:val="left" w:pos="7328"/>
+        <w:tab w:val="left" w:pos="8244"/>
+        <w:tab w:val="left" w:pos="9160"/>
+        <w:tab w:val="left" w:pos="10076"/>
+        <w:tab w:val="left" w:pos="10992"/>
+        <w:tab w:val="left" w:pos="11908"/>
+        <w:tab w:val="left" w:pos="12824"/>
+        <w:tab w:val="left" w:pos="13740"/>
+        <w:tab w:val="left" w:pos="14656"/>
+      </w:tabs>
+    </w:pPr>
+    <w:rPr>
+      <w:rFonts w:ascii="Courier New" w:hAnsi="Courier New" w:cs="Courier New"/>
+      <w:sz w:val="20"/>
+      <w:szCs w:val="20"/>
+      <w:lang w:val="en-US" w:eastAsia="en-US"/>
+    </w:rPr>
+  </w:style>
+  <w:style w:type="character" w:customStyle="1" w:styleId="HTMLPreformattedChar">
+    <w:name w:val="HTML Preformatted Char"/>
+    <w:basedOn w:val="DefaultParagraphFont"/>
+    <w:link w:val="HTMLPreformatted"/>
+    <w:uiPriority w:val="99"/>
+    <w:semiHidden/>
+    <w:rsid w:val="00DC0B34"/>
+    <w:rPr>
+      <w:rFonts w:ascii="Courier New" w:eastAsia="Times New Roman" w:hAnsi="Courier New" w:cs="Courier New"/>
+      <w:sz w:val="20"/>
+      <w:szCs w:val="20"/>
+      <w:lang w:val="en-US"/>
+    </w:rPr>
+  </w:style>
+  <w:style w:type="character" w:customStyle="1" w:styleId="token">
+    <w:name w:val="token"/>
+    <w:basedOn w:val="DefaultParagraphFont"/>
+    <w:rsid w:val="00DC0B34"/>
   </w:style>
 </w:styles>
 </file>

</xml_diff>